<commit_message>
Copa Manager: spec Gestao de Contas v1.1 - Banner Especial so em contas Padrao
Revisao da especificacao (documento apenas; F3 ainda nao implementada):
o Banner Especial passa a aparecer somente nas paginas publicas de
campeonatos de contas do tipo Padrao. Premium e Premium+ nao exibem.

- resumo executivo e secao 4 reescritos (exibicao gated pelo tipo da conta
  dona; vira incentivo de upgrade)
- RN-BE-02 restrita a contas Padrao; RN-BE-05 reconciliada (gestao global,
  exibicao por plano); RN-BE-06 nova (gate no tipo ATUAL em tempo de
  requisicao, sem dado gravado por campeonato)
- tabela de API e descricao da Fase 3 ajustadas
- validado no Word (7 paginas, sem reparo)

Co-Authored-By: Claude Fable 5 <noreply@anthropic.com>
Claude-Session: https://claude.ai/code/session_01NjBHmCdvqw5GcroWmiPd2v
</commit_message>
<xml_diff>
--- a/ClaudeCode/CopaManager/CopaManager Gestao de Contas.docx
+++ b/ClaudeCode/CopaManager/CopaManager Gestao de Contas.docx
@@ -7,7 +7,7 @@
         <w:pStyle w:val="Titulo"/>
       </w:pPr>
       <w:r>
-        <w:t>Copa Manager</w:t>
+        <w:t xml:space="preserve">Copa Manager</w:t>
       </w:r>
     </w:p>
     <w:p>
@@ -15,7 +15,7 @@
         <w:pStyle w:val="Subtitulo"/>
       </w:pPr>
       <w:r>
-        <w:t>Gestão de Contas e Colaboração — planos, limites, banners da plataforma e colaboradores</w:t>
+        <w:t xml:space="preserve">Gestão de Contas e Colaboração — planos, limites, banners da plataforma e colaboradores</w:t>
       </w:r>
     </w:p>
     <w:p>
@@ -23,7 +23,7 @@
         <w:pStyle w:val="Muted"/>
       </w:pPr>
       <w:r>
-        <w:t>Documento de Especificação Funcional — Versão 1.0 (proposta, aguardando aprovação)</w:t>
+        <w:t xml:space="preserve">Documento de Especificação Funcional — Versão 1.1 (Banner Especial restrito a contas Padrão)</w:t>
       </w:r>
     </w:p>
     <w:p>
@@ -31,7 +31,7 @@
         <w:pStyle w:val="Muted"/>
       </w:pPr>
       <w:r>
-        <w:t>Data: 17/07/2026  •  Autor: Theo Paoliello (com assistência de IA)</w:t>
+        <w:t xml:space="preserve">Data: 18/07/2026 (rev. 1.1; original 17/07/2026)  •  Autor: Theo Paoliello (com assistência de IA)</w:t>
       </w:r>
     </w:p>
     <w:p>
@@ -39,7 +39,7 @@
         <w:pStyle w:val="Muted"/>
       </w:pPr>
       <w:r>
-        <w:t>Produto em produção: https://copamanager.com.br</w:t>
+        <w:t xml:space="preserve">Produto em produção: https://copamanager.com.br</w:t>
       </w:r>
     </w:p>
     <w:p>
@@ -47,7 +47,7 @@
         <w:spacing w:before="40" w:after="80"/>
       </w:pPr>
       <w:r>
-        <w:t>Este documento especifica o pacote gerencial da plataforma: tipos de conta com limites de campeonatos, limites de estrutura (times e jogadores), liberação da seção Banners por conta, Banner Especial global do master, compartilhamento de campeonatos com Colaboradores e o fluxo "Esqueci minha senha". Nada aqui exige billing: os tipos de conta são atribuídos manualmente pela conta master. Contas existentes não perdem nada (grandfather).</w:t>
+        <w:t xml:space="preserve">Este documento especifica o pacote gerencial da plataforma: tipos de conta com limites de campeonatos, limites de estrutura (times e jogadores), liberação da seção Banners por conta, Banner Especial global do master, compartilhamento de campeonatos com Colaboradores e o fluxo "Esqueci minha senha". Nada aqui exige billing: os tipos de conta são atribuídos manualmente pela conta master. Contas existentes não perdem nada (grandfather).</w:t>
       </w:r>
     </w:p>
     <w:p>
@@ -55,7 +55,7 @@
         <w:pStyle w:val="Heading1"/>
       </w:pPr>
       <w:r>
-        <w:t>1. Resumo executivo — viabilidade e impacto</w:t>
+        <w:t xml:space="preserve">1. Resumo executivo — viabilidade e impacto</w:t>
       </w:r>
     </w:p>
     <w:p>
@@ -69,7 +69,7 @@
         <w:rPr>
           <w:b/>
         </w:rPr>
-        <w:t>Tipos de conta e limite de campeonatos.</w:t>
+        <w:t xml:space="preserve">Tipos de conta e limite de campeonatos.</w:t>
       </w:r>
       <w:r>
         <w:t xml:space="preserve"> Viabilidade alta, risco baixo: uma contagem no ato de criar campeonato + uma coluna de tipo com override por conta. É a base do modelo comercial (Padrão 3 / Premium 10 / Premium+ 30) com custo de horas, não dias.</w:t>
@@ -86,7 +86,7 @@
         <w:rPr>
           <w:b/>
         </w:rPr>
-        <w:t>Limites de estrutura (48 times / 30 jogadores por time).</w:t>
+        <w:t xml:space="preserve">Limites de estrutura (48 times / 30 jogadores por time).</w:t>
       </w:r>
       <w:r>
         <w:t xml:space="preserve"> Viabilidade alta: cinco pontos de inserção bem localizados (wizard, times, jogadores unitário/lote, pelada). Protege o banco e as páginas públicas contra abuso e cria mais um ajuste comercial por conta.</w:t>
@@ -103,7 +103,7 @@
         <w:rPr>
           <w:b/>
         </w:rPr>
-        <w:t>Painel de configuração de contas.</w:t>
+        <w:t xml:space="preserve">Painel de configuração de contas.</w:t>
       </w:r>
       <w:r>
         <w:t xml:space="preserve"> Viabilidade alta: estende o painel master existente (cards de contas + modal de edição) com tipo, overrides e flag de banners. Prepara o terreno para billing futuro sem retrabalho de modelo.</w:t>
@@ -120,7 +120,7 @@
         <w:rPr>
           <w:b/>
         </w:rPr>
-        <w:t>Seção Banners por liberação.</w:t>
+        <w:t xml:space="preserve">Seção Banners por liberação.</w:t>
       </w:r>
       <w:r>
         <w:t xml:space="preserve"> Viabilidade alta: flag por conta com grandfather (contas atuais continuam vendo), aba oculta no painel e bloqueio no servidor. Converte os banners em recurso liberável caso a caso.</w:t>
@@ -137,10 +137,10 @@
         <w:rPr>
           <w:b/>
         </w:rPr>
-        <w:t>Banner Especial do master.</w:t>
-      </w:r>
-      <w:r>
-        <w:t xml:space="preserve"> Viabilidade alta e a maior razão impacto/esforço do pacote: até 3 banners globais exibidos em TODAS as páginas públicas — canal de monetização/comunicação da plataforma com alcance imediato.</w:t>
+        <w:t xml:space="preserve">Banner Especial do master.</w:t>
+      </w:r>
+      <w:r>
+        <w:t xml:space="preserve"> Viabilidade alta e a maior razão impacto/esforço do pacote: até 3 banners globais exibidos apenas nas páginas públicas de campeonatos de contas do tipo Padrão (contas Premium e Premium+ não exibem) — canal de monetização/comunicação da plataforma e, ao mesmo tempo, incentivo de upgrade: subir de plano remove o Banner Especial dos campeonatos da conta.</w:t>
       </w:r>
     </w:p>
     <w:p>
@@ -154,7 +154,7 @@
         <w:rPr>
           <w:b/>
         </w:rPr>
-        <w:t>Colaboradores.</w:t>
+        <w:t xml:space="preserve">Colaboradores.</w:t>
       </w:r>
       <w:r>
         <w:t xml:space="preserve"> Viabilidade média: é a feature mais profunda porque toca o modelo de posse multi-tenant. O desenho preserva as validações atuais intactas (caminho novo em paralelo) e exige uma leva dedicada de testes de segurança. Destrava o caso real de campeonato organizado por comissão (mesário lança jogos, auxiliar cadastra elencos) sem compartilhar senha.</w:t>
@@ -171,7 +171,7 @@
         <w:rPr>
           <w:b/>
         </w:rPr>
-        <w:t>Esqueci minha senha.</w:t>
+        <w:t xml:space="preserve">Esqueci minha senha.</w:t>
       </w:r>
       <w:r>
         <w:t xml:space="preserve"> Viabilidade alta: espelho do fluxo de verificação de e-mail já em produção (token com hash, uso único, anti-enumeração, rate limit). Hoje só o master reseta senhas — é provavelmente a maior redução de suporte operacional do pacote.</w:t>
@@ -182,7 +182,7 @@
         <w:pStyle w:val="Heading1"/>
       </w:pPr>
       <w:r>
-        <w:t>2. Tipos de conta e limites</w:t>
+        <w:t xml:space="preserve">2. Tipos de conta e limites</w:t>
       </w:r>
     </w:p>
     <w:p>
@@ -196,7 +196,7 @@
         <w:rPr>
           <w:b/>
         </w:rPr>
-        <w:t>tipo</w:t>
+        <w:t xml:space="preserve">tipo</w:t>
       </w:r>
       <w:r>
         <w:t xml:space="preserve"> que define o limite padrão de campeonatos simultâneos. Não há cobrança no produto: o master atribui o tipo no painel de contas. Além do tipo, o master pode definir </w:t>
@@ -205,7 +205,7 @@
         <w:rPr>
           <w:b/>
         </w:rPr>
-        <w:t>overrides por conta</w:t>
+        <w:t xml:space="preserve">overrides por conta</w:t>
       </w:r>
       <w:r>
         <w:t xml:space="preserve"> (campeonatos, times por campeonato e jogadores por time); campo vazio = padrão do tipo/global.</w:t>
@@ -250,8 +250,7 @@
                 <w:color w:val="FFFFFF"/>
                 <w:sz w:val="19"/>
               </w:rPr>
-              <w:lastRenderedPageBreak/>
-              <w:t>Tipo de conta</w:t>
+              <w:t xml:space="preserve">Tipo de conta</w:t>
             </w:r>
           </w:p>
         </w:tc>
@@ -277,7 +276,7 @@
                 <w:color w:val="FFFFFF"/>
                 <w:sz w:val="19"/>
               </w:rPr>
-              <w:t>Campeonatos simultâneos</w:t>
+              <w:t xml:space="preserve">Campeonatos simultâneos</w:t>
             </w:r>
           </w:p>
         </w:tc>
@@ -303,7 +302,7 @@
                 <w:color w:val="FFFFFF"/>
                 <w:sz w:val="19"/>
               </w:rPr>
-              <w:t>Observação</w:t>
+              <w:t xml:space="preserve">Observação</w:t>
             </w:r>
           </w:p>
         </w:tc>
@@ -328,7 +327,7 @@
               <w:rPr>
                 <w:sz w:val="19"/>
               </w:rPr>
-              <w:t>Padrão</w:t>
+              <w:t xml:space="preserve">Padrão</w:t>
             </w:r>
           </w:p>
         </w:tc>
@@ -351,7 +350,7 @@
               <w:rPr>
                 <w:sz w:val="19"/>
               </w:rPr>
-              <w:t>3</w:t>
+              <w:t xml:space="preserve">3</w:t>
             </w:r>
           </w:p>
         </w:tc>
@@ -374,7 +373,7 @@
               <w:rPr>
                 <w:sz w:val="19"/>
               </w:rPr>
-              <w:t>Tipo das contas novas e das existentes (grandfather)</w:t>
+              <w:t xml:space="preserve">Tipo das contas novas e das existentes (grandfather)</w:t>
             </w:r>
           </w:p>
         </w:tc>
@@ -399,7 +398,7 @@
               <w:rPr>
                 <w:sz w:val="19"/>
               </w:rPr>
-              <w:t>Premium</w:t>
+              <w:t xml:space="preserve">Premium</w:t>
             </w:r>
           </w:p>
         </w:tc>
@@ -422,7 +421,7 @@
               <w:rPr>
                 <w:sz w:val="19"/>
               </w:rPr>
-              <w:t>10</w:t>
+              <w:t xml:space="preserve">10</w:t>
             </w:r>
           </w:p>
         </w:tc>
@@ -445,7 +444,7 @@
               <w:rPr>
                 <w:sz w:val="19"/>
               </w:rPr>
-              <w:t>Atribuído pelo master</w:t>
+              <w:t xml:space="preserve">Atribuído pelo master</w:t>
             </w:r>
           </w:p>
         </w:tc>
@@ -470,7 +469,7 @@
               <w:rPr>
                 <w:sz w:val="19"/>
               </w:rPr>
-              <w:t>Premium+</w:t>
+              <w:t xml:space="preserve">Premium+</w:t>
             </w:r>
           </w:p>
         </w:tc>
@@ -493,7 +492,7 @@
               <w:rPr>
                 <w:sz w:val="19"/>
               </w:rPr>
-              <w:t>30</w:t>
+              <w:t xml:space="preserve">30</w:t>
             </w:r>
           </w:p>
         </w:tc>
@@ -516,7 +515,7 @@
               <w:rPr>
                 <w:sz w:val="19"/>
               </w:rPr>
-              <w:t>Atribuído pelo master</w:t>
+              <w:t xml:space="preserve">Atribuído pelo master</w:t>
             </w:r>
           </w:p>
         </w:tc>
@@ -533,7 +532,7 @@
         <w:t xml:space="preserve">Limites de estrutura globais: </w:t>
       </w:r>
       <w:r>
-        <w:t>48 times por campeonato e 30 jogadores por time, iguais para todos os tipos, com override por conta pelo master. A contagem de campeonatos inclui os arquivados: para criar além do teto, é preciso excluir um. As validações são exclusivamente do servidor; o painel apenas exibe o consumo ("2/3") na tela Meus campeonatos e orienta quando o limite enche.</w:t>
+        <w:t xml:space="preserve">48 times por campeonato e 30 jogadores por time, iguais para todos os tipos, com override por conta pelo master. A contagem de campeonatos inclui os arquivados: para criar além do teto, é preciso excluir um. As validações são exclusivamente do servidor; o painel apenas exibe o consumo ("2/3") na tela Meus campeonatos e orienta quando o limite enche.</w:t>
       </w:r>
     </w:p>
     <w:p>
@@ -547,7 +546,7 @@
         <w:t xml:space="preserve">Grandfather: </w:t>
       </w:r>
       <w:r>
-        <w:t>contas existentes na data da migração viram Padrão e nada é excluído — quem estiver acima de um limite apenas não cria itens novos até ajustar com o master.</w:t>
+        <w:t xml:space="preserve">contas existentes na data da migração viram Padrão e nada é excluído — quem estiver acima de um limite apenas não cria itens novos até ajustar com o master.</w:t>
       </w:r>
     </w:p>
     <w:p>
@@ -555,7 +554,7 @@
         <w:pStyle w:val="Heading1"/>
       </w:pPr>
       <w:r>
-        <w:t>3. Seção Banners por liberação</w:t>
+        <w:t xml:space="preserve">3. Seção Banners por liberação</w:t>
       </w:r>
     </w:p>
     <w:p>
@@ -563,7 +562,7 @@
         <w:spacing w:before="40" w:after="80"/>
       </w:pPr>
       <w:r>
-        <w:t>Contas novas nascem SEM a seção Banners (aba oculta e bloqueio no servidor). O master liga/desliga a flag por conta no painel. Todas as contas existentes recebem a flag ligada na migração (grandfather). Se a flag for desligada depois, os banners já publicados continuam na página pública — apenas a gestão fica bloqueada (o master pode entrar na conta e removê-los). A flag consultada é sempre a da conta DONA do campeonato: colaboradores e o modo tenant do master não mudam a regra.</w:t>
+        <w:t xml:space="preserve">Contas novas nascem SEM a seção Banners (aba oculta e bloqueio no servidor). O master liga/desliga a flag por conta no painel. Todas as contas existentes recebem a flag ligada na migração (grandfather). Se a flag for desligada depois, os banners já publicados continuam na página pública — apenas a gestão fica bloqueada (o master pode entrar na conta e removê-los). A flag consultada é sempre a da conta DONA do campeonato: colaboradores e o modo tenant do master não mudam a regra.</w:t>
       </w:r>
     </w:p>
     <w:p>
@@ -571,7 +570,7 @@
         <w:pStyle w:val="Heading1"/>
       </w:pPr>
       <w:r>
-        <w:t>4. Banner Especial (master)</w:t>
+        <w:t xml:space="preserve">4. Banner Especial (master)</w:t>
       </w:r>
     </w:p>
     <w:p>
@@ -585,10 +584,28 @@
         <w:rPr>
           <w:b/>
         </w:rPr>
-        <w:t>3 banners globais</w:t>
-      </w:r>
-      <w:r>
-        <w:t xml:space="preserve"> (imagem + link), exibidos nas páginas públicas de TODOS os campeonatos, acima dos banners do próprio campeonato, no mesmo bloco visual "Apoio". Ativar/desativar tem efeito imediato em toda a plataforma. Mesmas validações dos banners comuns (somente links http/https, mesma rotina de imagem). Banners globais não pertencem a conta nem campeonato: exclusões de contas/campeonatos não os afetam, e aparecem inclusive em campeonatos de contas com a seção Banners bloqueada — a receita é da plataforma.</w:t>
+        <w:t xml:space="preserve">3 banners globais</w:t>
+      </w:r>
+      <w:r>
+        <w:t xml:space="preserve"> (imagem + link), exibidos nas páginas públicas dos campeonatos de contas do tipo </w:t>
+      </w:r>
+      <w:r>
+        <w:rPr>
+          <w:b/>
+        </w:rPr>
+        <w:t xml:space="preserve">Padrão</w:t>
+      </w:r>
+      <w:r>
+        <w:t xml:space="preserve"> — contas </w:t>
+      </w:r>
+      <w:r>
+        <w:rPr>
+          <w:b/>
+        </w:rPr>
+        <w:t xml:space="preserve">Premium e Premium+ não exibem o Banner Especial</w:t>
+      </w:r>
+      <w:r>
+        <w:t xml:space="preserve">. Aparecem acima dos banners do próprio campeonato, no mesmo bloco visual "Apoio". Ativar/desativar tem efeito imediato em toda a plataforma. Mesmas validações dos banners comuns (somente links http/https, mesma rotina de imagem). Os banners globais não pertencem a conta nem campeonato (só o master os edita; exclusões de contas/campeonatos não os afetam), mas a EXIBIÇÃO depende do tipo da conta dona do campeonato: valem só em contas Padrão, inclusive quando a seção Banners dessa conta está bloqueada. A restrição por plano transforma o Banner Especial em incentivo de upgrade — a receita é da plataforma nas contas Padrão, e some assim que a conta vira Premium.</w:t>
       </w:r>
     </w:p>
     <w:p>
@@ -596,7 +613,7 @@
         <w:pStyle w:val="Heading1"/>
       </w:pPr>
       <w:r>
-        <w:t>5. Colaboradores — compartilhar o campeonato</w:t>
+        <w:t xml:space="preserve">5. Colaboradores — compartilhar o campeonato</w:t>
       </w:r>
     </w:p>
     <w:p>
@@ -610,10 +627,10 @@
         <w:rPr>
           <w:b/>
         </w:rPr>
-        <w:t>2 pessoas</w:t>
-      </w:r>
-      <w:r>
-        <w:t>, por e-mail, definindo o que cada uma acessa pelas flags: Jogos, Times, Regras e Sorteio (esta apenas na Pelada Épica). Todo colaborador também vê a Classificação (somente leitura). Configurações, Banners, gerar mata-mata e a própria gestão de colaboradores permanecem exclusivos do dono — gerar o mata é ação estrutural e irreversível; config e banners são a posse e a relação comercial do campeonato.</w:t>
+        <w:t xml:space="preserve">2 pessoas</w:t>
+      </w:r>
+      <w:r>
+        <w:t xml:space="preserve">, por e-mail, definindo o que cada uma acessa pelas flags: Jogos, Times, Regras e Sorteio (esta apenas na Pelada Épica). Todo colaborador também vê a Classificação (somente leitura). Configurações, Banners, gerar mata-mata e a própria gestão de colaboradores permanecem exclusivos do dono — gerar o mata é ação estrutural e irreversível; config e banners são a posse e a relação comercial do campeonato.</w:t>
       </w:r>
     </w:p>
     <w:tbl>
@@ -654,7 +671,7 @@
                 <w:color w:val="FFFFFF"/>
                 <w:sz w:val="19"/>
               </w:rPr>
-              <w:t>Flag</w:t>
+              <w:t xml:space="preserve">Flag</w:t>
             </w:r>
           </w:p>
         </w:tc>
@@ -680,7 +697,7 @@
                 <w:color w:val="FFFFFF"/>
                 <w:sz w:val="19"/>
               </w:rPr>
-              <w:t>O que libera</w:t>
+              <w:t xml:space="preserve">O que libera</w:t>
             </w:r>
           </w:p>
         </w:tc>
@@ -706,7 +723,7 @@
                 <w:b/>
                 <w:sz w:val="19"/>
               </w:rPr>
-              <w:t>Jogos</w:t>
+              <w:t xml:space="preserve">Jogos</w:t>
             </w:r>
           </w:p>
         </w:tc>
@@ -729,7 +746,7 @@
               <w:rPr>
                 <w:sz w:val="19"/>
               </w:rPr>
-              <w:t>Agendar, lançar/corrigir/apagar resultados, súmula; criar/excluir jogos avulsos na pelada. NÃO inclui gerar o mata-mata.</w:t>
+              <w:t xml:space="preserve">Agendar, lançar/corrigir/apagar resultados, súmula; criar/excluir jogos avulsos na pelada. NÃO inclui gerar o mata-mata.</w:t>
             </w:r>
           </w:p>
         </w:tc>
@@ -755,7 +772,7 @@
                 <w:b/>
                 <w:sz w:val="19"/>
               </w:rPr>
-              <w:t>Times</w:t>
+              <w:t xml:space="preserve">Times</w:t>
             </w:r>
           </w:p>
         </w:tc>
@@ -778,7 +795,7 @@
               <w:rPr>
                 <w:sz w:val="19"/>
               </w:rPr>
-              <w:t>Cadastrar/editar times, escudos e fotos; cadastrar/editar jogadores (inclusive em lote e na pelada).</w:t>
+              <w:t xml:space="preserve">Cadastrar/editar times, escudos e fotos; cadastrar/editar jogadores (inclusive em lote e na pelada).</w:t>
             </w:r>
           </w:p>
         </w:tc>
@@ -804,7 +821,7 @@
                 <w:b/>
                 <w:sz w:val="19"/>
               </w:rPr>
-              <w:t>Regras</w:t>
+              <w:t xml:space="preserve">Regras</w:t>
             </w:r>
           </w:p>
         </w:tc>
@@ -827,7 +844,7 @@
               <w:rPr>
                 <w:sz w:val="19"/>
               </w:rPr>
-              <w:t>Editar o texto de regras do campeonato (rota dedicada, separada da Config).</w:t>
+              <w:t xml:space="preserve">Editar o texto de regras do campeonato (rota dedicada, separada da Config).</w:t>
             </w:r>
           </w:p>
         </w:tc>
@@ -853,7 +870,7 @@
                 <w:b/>
                 <w:sz w:val="19"/>
               </w:rPr>
-              <w:t>Sorteio</w:t>
+              <w:t xml:space="preserve">Sorteio</w:t>
             </w:r>
           </w:p>
         </w:tc>
@@ -876,7 +893,7 @@
               <w:rPr>
                 <w:sz w:val="19"/>
               </w:rPr>
-              <w:t>Pelada Épica: presença do dia, sorteio Premium/simples e confirmação do jogo.</w:t>
+              <w:t xml:space="preserve">Pelada Épica: presença do dia, sorteio Premium/simples e confirmação do jogo.</w:t>
             </w:r>
           </w:p>
         </w:tc>
@@ -893,11 +910,7 @@
         <w:t xml:space="preserve">Convite: </w:t>
       </w:r>
       <w:r>
-        <w:t xml:space="preserve">se o e-mail já tem conta, o vínculo ativa na hora; senão fica pendente e ativa automaticamente quando a pessoa criar a conta com aquele e-mail e confirmá-lo (ou entrar com Google) — exigir e-mail confirmado impede que alguém registre o e-mail de terceiro para herdar o convite. Convite pendente não dá acesso algum. </w:t>
-      </w:r>
-      <w:r>
-        <w:lastRenderedPageBreak/>
-        <w:t>O colaborador vê o campeonato numa seção "Compartilhados comigo" da sua lista, que NÃO conta no limite de campeonatos dele. Remoção pelo dono revoga o acesso na requisição seguinte (nada fica em sessão).</w:t>
+        <w:t xml:space="preserve">se o e-mail já tem conta, o vínculo ativa na hora; senão fica pendente e ativa automaticamente quando a pessoa criar a conta com aquele e-mail e confirmá-lo (ou entrar com Google) — exigir e-mail confirmado impede que alguém registre o e-mail de terceiro para herdar o convite. Convite pendente não dá acesso algum. O colaborador vê o campeonato numa seção "Compartilhados comigo" da sua lista, que NÃO conta no limite de campeonatos dele. Remoção pelo dono revoga o acesso na requisição seguinte (nada fica em sessão).</w:t>
       </w:r>
     </w:p>
     <w:p>
@@ -911,7 +924,7 @@
         <w:t xml:space="preserve">Segurança: </w:t>
       </w:r>
       <w:r>
-        <w:t>quem não tem vínculo nenhum continua recebendo 404 genérico (anti-enumeração preservada); colaborador sem a flag da seção recebe 403. As validações de posse atuais não são alteradas — o acesso de colaborador entra por funções novas, em paralelo, usadas apenas nas rotas das seções compartilháveis.</w:t>
+        <w:t xml:space="preserve">quem não tem vínculo nenhum continua recebendo 404 genérico (anti-enumeração preservada); colaborador sem a flag da seção recebe 403. As validações de posse atuais não são alteradas — o acesso de colaborador entra por funções novas, em paralelo, usadas apenas nas rotas das seções compartilháveis.</w:t>
       </w:r>
     </w:p>
     <w:p>
@@ -919,7 +932,7 @@
         <w:pStyle w:val="Heading1"/>
       </w:pPr>
       <w:r>
-        <w:t>6. Esqueci minha senha</w:t>
+        <w:t xml:space="preserve">6. Esqueci minha senha</w:t>
       </w:r>
     </w:p>
     <w:p>
@@ -927,7 +940,7 @@
         <w:spacing w:before="40" w:after="80"/>
       </w:pPr>
       <w:r>
-        <w:t>Na tela de login, o link "Esqueci minha senha" pede o e-mail e responde sempre com a mesma mensagem (não revela se o e-mail tem conta). Quem tem conta recebe um e-mail com link de redefinição (válido por 1 hora, uso único; pedir novo link invalida os anteriores). A página de redefinição pede a nova senha e, ao confirmar: troca a senha, derruba TODAS as sessões abertas da conta e abre uma sessão nova (a pessoa cai logada no painel). Contas que só usam o Login com Google não têm senha: o e-mail enviado é informativo ("entre pelo botão Entrar com Google"), sem link. O fluxo espelha a verificação de e-mail já em produção: token aleatório com apenas o hash no banco, expiração, uso único, rate limit próprio e página que dispara a confirmação por POST (robôs de antivírus não consomem o token).</w:t>
+        <w:t xml:space="preserve">Na tela de login, o link "Esqueci minha senha" pede o e-mail e responde sempre com a mesma mensagem (não revela se o e-mail tem conta). Quem tem conta recebe um e-mail com link de redefinição (válido por 1 hora, uso único; pedir novo link invalida os anteriores). A página de redefinição pede a nova senha e, ao confirmar: troca a senha, derruba TODAS as sessões abertas da conta e abre uma sessão nova (a pessoa cai logada no painel). Contas que só usam o Login com Google não têm senha: o e-mail enviado é informativo ("entre pelo botão Entrar com Google"), sem link. O fluxo espelha a verificação de e-mail já em produção: token aleatório com apenas o hash no banco, expiração, uso único, rate limit próprio e página que dispara a confirmação por POST (robôs de antivírus não consomem o token).</w:t>
       </w:r>
     </w:p>
     <w:p>
@@ -935,7 +948,7 @@
         <w:pStyle w:val="Heading1"/>
       </w:pPr>
       <w:r>
-        <w:t>7. Regras de negócio</w:t>
+        <w:t xml:space="preserve">7. Regras de negócio</w:t>
       </w:r>
     </w:p>
     <w:p>
@@ -943,7 +956,7 @@
         <w:pStyle w:val="Heading3"/>
       </w:pPr>
       <w:r>
-        <w:t>7.1 Tipos de conta e limites (RN-GC)</w:t>
+        <w:t xml:space="preserve">7.1 Tipos de conta e limites (RN-GC)</w:t>
       </w:r>
     </w:p>
     <w:tbl>
@@ -984,7 +997,7 @@
                 <w:color w:val="FFFFFF"/>
                 <w:sz w:val="19"/>
               </w:rPr>
-              <w:t>Código</w:t>
+              <w:t xml:space="preserve">Código</w:t>
             </w:r>
           </w:p>
         </w:tc>
@@ -1010,7 +1023,7 @@
                 <w:color w:val="FFFFFF"/>
                 <w:sz w:val="19"/>
               </w:rPr>
-              <w:t>Regra</w:t>
+              <w:t xml:space="preserve">Regra</w:t>
             </w:r>
           </w:p>
         </w:tc>
@@ -1036,7 +1049,7 @@
                 <w:b/>
                 <w:sz w:val="19"/>
               </w:rPr>
-              <w:t>RN-GC-01</w:t>
+              <w:t xml:space="preserve">RN-GC-01</w:t>
             </w:r>
           </w:p>
         </w:tc>
@@ -1059,7 +1072,7 @@
               <w:rPr>
                 <w:sz w:val="19"/>
               </w:rPr>
-              <w:t>Toda conta tem um tipo: padrão (3 campeonatos simultâneos), premium (10) ou premium+ (30). Contas novas nascem padrão. Sem billing: o tipo é atribuído pelo master.</w:t>
+              <w:t xml:space="preserve">Toda conta tem um tipo: padrão (3 campeonatos simultâneos), premium (10) ou premium+ (30). Contas novas nascem padrão. Sem billing: o tipo é atribuído pelo master.</w:t>
             </w:r>
           </w:p>
         </w:tc>
@@ -1085,7 +1098,7 @@
                 <w:b/>
                 <w:sz w:val="19"/>
               </w:rPr>
-              <w:t>RN-GC-02</w:t>
+              <w:t xml:space="preserve">RN-GC-02</w:t>
             </w:r>
           </w:p>
         </w:tc>
@@ -1108,7 +1121,7 @@
               <w:rPr>
                 <w:sz w:val="19"/>
               </w:rPr>
-              <w:t>O limite de campeonatos conta TODOS os campeonatos da conta (ativos e arquivados) — para criar outro além do teto, é preciso excluir um. Verificação exclusivamente no servidor, na criação.</w:t>
+              <w:t xml:space="preserve">O limite de campeonatos conta TODOS os campeonatos da conta (ativos e arquivados) — para criar outro além do teto, é preciso excluir um. Verificação exclusivamente no servidor, na criação.</w:t>
             </w:r>
           </w:p>
         </w:tc>
@@ -1134,7 +1147,7 @@
                 <w:b/>
                 <w:sz w:val="19"/>
               </w:rPr>
-              <w:t>RN-GC-03</w:t>
+              <w:t xml:space="preserve">RN-GC-03</w:t>
             </w:r>
           </w:p>
         </w:tc>
@@ -1157,7 +1170,7 @@
               <w:rPr>
                 <w:sz w:val="19"/>
               </w:rPr>
-              <w:t>Estouro do limite: erro 409 "Sua conta atingiu o limite de N campeonatos simultâneos. Exclua um campeonato que já terminou ou fale com o suporte para ampliar seu plano."</w:t>
+              <w:t xml:space="preserve">Estouro do limite: erro 409 "Sua conta atingiu o limite de N campeonatos simultâneos. Exclua um campeonato que já terminou ou fale com o suporte para ampliar seu plano."</w:t>
             </w:r>
           </w:p>
         </w:tc>
@@ -1183,7 +1196,7 @@
                 <w:b/>
                 <w:sz w:val="19"/>
               </w:rPr>
-              <w:t>RN-GC-04</w:t>
+              <w:t xml:space="preserve">RN-GC-04</w:t>
             </w:r>
           </w:p>
         </w:tc>
@@ -1206,7 +1219,7 @@
               <w:rPr>
                 <w:sz w:val="19"/>
               </w:rPr>
-              <w:t>O master pode definir override por conta (máx. de campeonatos); o override tem precedência sobre o tipo. Limpar o override volta ao padrão do tipo.</w:t>
+              <w:t xml:space="preserve">O master pode definir override por conta (máx. de campeonatos); o override tem precedência sobre o tipo. Limpar o override volta ao padrão do tipo.</w:t>
             </w:r>
           </w:p>
         </w:tc>
@@ -1232,7 +1245,7 @@
                 <w:b/>
                 <w:sz w:val="19"/>
               </w:rPr>
-              <w:t>RN-GC-05</w:t>
+              <w:t xml:space="preserve">RN-GC-05</w:t>
             </w:r>
           </w:p>
         </w:tc>
@@ -1255,7 +1268,7 @@
               <w:rPr>
                 <w:sz w:val="19"/>
               </w:rPr>
-              <w:t>Limites de estrutura globais: 48 times por campeonato e 30 jogadores por time, com override por conta pelo master.</w:t>
+              <w:t xml:space="preserve">Limites de estrutura globais: 48 times por campeonato e 30 jogadores por time, com override por conta pelo master.</w:t>
             </w:r>
           </w:p>
         </w:tc>
@@ -1281,7 +1294,7 @@
                 <w:b/>
                 <w:sz w:val="19"/>
               </w:rPr>
-              <w:t>RN-GC-06</w:t>
+              <w:t xml:space="preserve">RN-GC-06</w:t>
             </w:r>
           </w:p>
         </w:tc>
@@ -1304,7 +1317,7 @@
               <w:rPr>
                 <w:sz w:val="19"/>
               </w:rPr>
-              <w:t>Estouro de estrutura: erro 409 ("Limite de N times por campeonato." / "Limite de N jogadores por time."). No cadastro em lote, a validação considera existentes + lote antes de inserir qualquer linha (tudo ou nada).</w:t>
+              <w:t xml:space="preserve">Estouro de estrutura: erro 409 ("Limite de N times por campeonato." / "Limite de N jogadores por time."). No cadastro em lote, a validação considera existentes + lote antes de inserir qualquer linha (tudo ou nada).</w:t>
             </w:r>
           </w:p>
         </w:tc>
@@ -1330,7 +1343,7 @@
                 <w:b/>
                 <w:sz w:val="19"/>
               </w:rPr>
-              <w:t>RN-GC-07</w:t>
+              <w:t xml:space="preserve">RN-GC-07</w:t>
             </w:r>
           </w:p>
         </w:tc>
@@ -1353,7 +1366,7 @@
               <w:rPr>
                 <w:sz w:val="19"/>
               </w:rPr>
-              <w:t>Pelada Épica (jogadores sem time fixo): o teto é por campeonato = máx. de jogadores por time × nº de times/divisões (padrão: 2 divisões = 60 jogadores). A confirmar.</w:t>
+              <w:t xml:space="preserve">Pelada Épica (jogadores sem time fixo): o teto é por campeonato = máx. de jogadores por time × nº de times/divisões (padrão: 2 divisões = 60 jogadores). A confirmar.</w:t>
             </w:r>
           </w:p>
         </w:tc>
@@ -1379,7 +1392,7 @@
                 <w:b/>
                 <w:sz w:val="19"/>
               </w:rPr>
-              <w:t>RN-GC-08</w:t>
+              <w:t xml:space="preserve">RN-GC-08</w:t>
             </w:r>
           </w:p>
         </w:tc>
@@ -1402,7 +1415,7 @@
               <w:rPr>
                 <w:sz w:val="19"/>
               </w:rPr>
-              <w:t>Os limites de estrutura valem pela conta DONA do campeonato, mesmo quando quem opera é colaborador ou o master em modo tenant.</w:t>
+              <w:t xml:space="preserve">Os limites de estrutura valem pela conta DONA do campeonato, mesmo quando quem opera é colaborador ou o master em modo tenant.</w:t>
             </w:r>
           </w:p>
         </w:tc>
@@ -1428,7 +1441,7 @@
                 <w:b/>
                 <w:sz w:val="19"/>
               </w:rPr>
-              <w:t>RN-GC-09</w:t>
+              <w:t xml:space="preserve">RN-GC-09</w:t>
             </w:r>
           </w:p>
         </w:tc>
@@ -1451,7 +1464,7 @@
               <w:rPr>
                 <w:sz w:val="19"/>
               </w:rPr>
-              <w:t>Grandfather: contas pré-existentes viram padrão na migração. Quem exceder qualquer limite não perde nada — apenas não cria itens novos.</w:t>
+              <w:t xml:space="preserve">Grandfather: contas pré-existentes viram padrão na migração. Quem exceder qualquer limite não perde nada — apenas não cria itens novos.</w:t>
             </w:r>
           </w:p>
         </w:tc>
@@ -1477,7 +1490,7 @@
                 <w:b/>
                 <w:sz w:val="19"/>
               </w:rPr>
-              <w:t>RN-GC-10</w:t>
+              <w:t xml:space="preserve">RN-GC-10</w:t>
             </w:r>
           </w:p>
         </w:tc>
@@ -1500,7 +1513,7 @@
               <w:rPr>
                 <w:sz w:val="19"/>
               </w:rPr>
-              <w:t>O master edita tipo e overrides no painel; overrides aceitam inteiro ≥ 1 ou vazio (= padrão). Tipo inválido: erro 400.</w:t>
+              <w:t xml:space="preserve">O master edita tipo e overrides no painel; overrides aceitam inteiro ≥ 1 ou vazio (= padrão). Tipo inválido: erro 400.</w:t>
             </w:r>
           </w:p>
         </w:tc>
@@ -1526,7 +1539,7 @@
                 <w:b/>
                 <w:sz w:val="19"/>
               </w:rPr>
-              <w:t>RN-GC-11</w:t>
+              <w:t xml:space="preserve">RN-GC-11</w:t>
             </w:r>
           </w:p>
         </w:tc>
@@ -1549,7 +1562,7 @@
               <w:rPr>
                 <w:sz w:val="19"/>
               </w:rPr>
-              <w:t>O master pode alterar o próprio tipo/limites, mas segue não podendo rebaixar o próprio papel (regra existente preservada).</w:t>
+              <w:t xml:space="preserve">O master pode alterar o próprio tipo/limites, mas segue não podendo rebaixar o próprio papel (regra existente preservada).</w:t>
             </w:r>
           </w:p>
         </w:tc>
@@ -1575,7 +1588,7 @@
                 <w:b/>
                 <w:sz w:val="19"/>
               </w:rPr>
-              <w:t>RN-GC-12</w:t>
+              <w:t xml:space="preserve">RN-GC-12</w:t>
             </w:r>
           </w:p>
         </w:tc>
@@ -1598,7 +1611,7 @@
               <w:rPr>
                 <w:sz w:val="19"/>
               </w:rPr>
-              <w:t>O organizador vê o próprio consumo ("2/3") na lista de campeonatos; com o limite cheio, o botão de criar orienta com a mensagem da RN-GC-03. A fonte da verdade é o servidor.</w:t>
+              <w:t xml:space="preserve">O organizador vê o próprio consumo ("2/3") na lista de campeonatos; com o limite cheio, o botão de criar orienta com a mensagem da RN-GC-03. A fonte da verdade é o servidor.</w:t>
             </w:r>
           </w:p>
         </w:tc>
@@ -1609,8 +1622,7 @@
         <w:pStyle w:val="Heading3"/>
       </w:pPr>
       <w:r>
-        <w:lastRenderedPageBreak/>
-        <w:t>7.2 Seção Banners por liberação (RN-BA)</w:t>
+        <w:t xml:space="preserve">7.2 Seção Banners por liberação (RN-BA)</w:t>
       </w:r>
     </w:p>
     <w:tbl>
@@ -1651,7 +1663,7 @@
                 <w:color w:val="FFFFFF"/>
                 <w:sz w:val="19"/>
               </w:rPr>
-              <w:t>Código</w:t>
+              <w:t xml:space="preserve">Código</w:t>
             </w:r>
           </w:p>
         </w:tc>
@@ -1677,7 +1689,7 @@
                 <w:color w:val="FFFFFF"/>
                 <w:sz w:val="19"/>
               </w:rPr>
-              <w:t>Regra</w:t>
+              <w:t xml:space="preserve">Regra</w:t>
             </w:r>
           </w:p>
         </w:tc>
@@ -1703,7 +1715,7 @@
                 <w:b/>
                 <w:sz w:val="19"/>
               </w:rPr>
-              <w:t>RN-BA-01</w:t>
+              <w:t xml:space="preserve">RN-BA-01</w:t>
             </w:r>
           </w:p>
         </w:tc>
@@ -1726,7 +1738,7 @@
               <w:rPr>
                 <w:sz w:val="19"/>
               </w:rPr>
-              <w:t>A seção Banners só existe para contas com a flag ligada. Contas novas nascem com a flag desligada; o master liga/desliga por conta.</w:t>
+              <w:t xml:space="preserve">A seção Banners só existe para contas com a flag ligada. Contas novas nascem com a flag desligada; o master liga/desliga por conta.</w:t>
             </w:r>
           </w:p>
         </w:tc>
@@ -1752,7 +1764,7 @@
                 <w:b/>
                 <w:sz w:val="19"/>
               </w:rPr>
-              <w:t>RN-BA-02</w:t>
+              <w:t xml:space="preserve">RN-BA-02</w:t>
             </w:r>
           </w:p>
         </w:tc>
@@ -1775,7 +1787,7 @@
               <w:rPr>
                 <w:sz w:val="19"/>
               </w:rPr>
-              <w:t>Grandfather: todas as contas existentes na data da migração recebem a flag ligada (backfill único).</w:t>
+              <w:t xml:space="preserve">Grandfather: todas as contas existentes na data da migração recebem a flag ligada (backfill único).</w:t>
             </w:r>
           </w:p>
         </w:tc>
@@ -1801,7 +1813,7 @@
                 <w:b/>
                 <w:sz w:val="19"/>
               </w:rPr>
-              <w:t>RN-BA-03</w:t>
+              <w:t xml:space="preserve">RN-BA-03</w:t>
             </w:r>
           </w:p>
         </w:tc>
@@ -1824,7 +1836,7 @@
               <w:rPr>
                 <w:sz w:val="19"/>
               </w:rPr>
-              <w:t>Flag desligada: aba oculta no painel e bloqueio no servidor com 403 "O recurso de banners não está habilitado para esta conta. Fale com o suporte." A flag consultada é sempre a da conta dona.</w:t>
+              <w:t xml:space="preserve">Flag desligada: aba oculta no painel e bloqueio no servidor com 403 "O recurso de banners não está habilitado para esta conta. Fale com o suporte." A flag consultada é sempre a da conta dona.</w:t>
             </w:r>
           </w:p>
         </w:tc>
@@ -1850,7 +1862,7 @@
                 <w:b/>
                 <w:sz w:val="19"/>
               </w:rPr>
-              <w:t>RN-BA-04</w:t>
+              <w:t xml:space="preserve">RN-BA-04</w:t>
             </w:r>
           </w:p>
         </w:tc>
@@ -1873,7 +1885,7 @@
               <w:rPr>
                 <w:sz w:val="19"/>
               </w:rPr>
-              <w:t>Revogação com banners já criados: os banners existentes continuam na página pública; apenas a gestão/criação fica bloqueada. Para removê-los, o master entra na conta (modo tenant).</w:t>
+              <w:t xml:space="preserve">Revogação com banners já criados: os banners existentes continuam na página pública; apenas a gestão/criação fica bloqueada. Para removê-los, o master entra na conta (modo tenant).</w:t>
             </w:r>
           </w:p>
         </w:tc>
@@ -1899,7 +1911,7 @@
                 <w:b/>
                 <w:sz w:val="19"/>
               </w:rPr>
-              <w:t>RN-BA-05</w:t>
+              <w:t xml:space="preserve">RN-BA-05</w:t>
             </w:r>
           </w:p>
         </w:tc>
@@ -1922,7 +1934,7 @@
               <w:rPr>
                 <w:sz w:val="19"/>
               </w:rPr>
-              <w:t>Colaboradores nunca acessam Banners, independentemente da flag da conta dona.</w:t>
+              <w:t xml:space="preserve">Colaboradores nunca acessam Banners, independentemente da flag da conta dona.</w:t>
             </w:r>
           </w:p>
         </w:tc>
@@ -1931,15 +1943,9 @@
     <w:p>
       <w:pPr>
         <w:pStyle w:val="Heading3"/>
-        <w:rPr>
-          <w:lang w:val="en-US"/>
-        </w:rPr>
       </w:pPr>
       <w:r>
-        <w:rPr>
-          <w:lang w:val="en-US"/>
-        </w:rPr>
-        <w:t>7.3 Banner Especial do master (RN-BE)</w:t>
+        <w:t xml:space="preserve">7.3 Banner Especial do master (RN-BE)</w:t>
       </w:r>
     </w:p>
     <w:tbl>
@@ -1980,7 +1986,7 @@
                 <w:color w:val="FFFFFF"/>
                 <w:sz w:val="19"/>
               </w:rPr>
-              <w:t>Código</w:t>
+              <w:t xml:space="preserve">Código</w:t>
             </w:r>
           </w:p>
         </w:tc>
@@ -2006,7 +2012,7 @@
                 <w:color w:val="FFFFFF"/>
                 <w:sz w:val="19"/>
               </w:rPr>
-              <w:t>Regra</w:t>
+              <w:t xml:space="preserve">Regra</w:t>
             </w:r>
           </w:p>
         </w:tc>
@@ -2032,7 +2038,7 @@
                 <w:b/>
                 <w:sz w:val="19"/>
               </w:rPr>
-              <w:t>RN-BE-01</w:t>
+              <w:t xml:space="preserve">RN-BE-01</w:t>
             </w:r>
           </w:p>
         </w:tc>
@@ -2055,7 +2061,7 @@
               <w:rPr>
                 <w:sz w:val="19"/>
               </w:rPr>
-              <w:t>Existem até 3 banners globais, geridos apenas pelo master. O 4º é recusado com 409 "Limite de 3 banners globais."</w:t>
+              <w:t xml:space="preserve">Existem até 3 banners globais, geridos apenas pelo master. O 4º é recusado com 409 "Limite de 3 banners globais."</w:t>
             </w:r>
           </w:p>
         </w:tc>
@@ -2081,7 +2087,7 @@
                 <w:b/>
                 <w:sz w:val="19"/>
               </w:rPr>
-              <w:t>RN-BE-02</w:t>
+              <w:t xml:space="preserve">RN-BE-02</w:t>
             </w:r>
           </w:p>
         </w:tc>
@@ -2104,7 +2110,7 @@
               <w:rPr>
                 <w:sz w:val="19"/>
               </w:rPr>
-              <w:t>Banners globais ativos aparecem em TODAS as páginas públicas, acima dos banners do próprio campeonato, na ordem definida.</w:t>
+              <w:t xml:space="preserve">Banners globais ativos aparecem apenas nas páginas públicas de campeonatos de contas do tipo Padrão, acima dos banners do próprio campeonato, na ordem definida. Contas Premium e Premium+ NÃO exibem o Banner Especial.</w:t>
             </w:r>
           </w:p>
         </w:tc>
@@ -2130,7 +2136,7 @@
                 <w:b/>
                 <w:sz w:val="19"/>
               </w:rPr>
-              <w:t>RN-BE-03</w:t>
+              <w:t xml:space="preserve">RN-BE-03</w:t>
             </w:r>
           </w:p>
         </w:tc>
@@ -2153,7 +2159,7 @@
               <w:rPr>
                 <w:sz w:val="19"/>
               </w:rPr>
-              <w:t>Banner global inativo some imediatamente de todas as páginas públicas; o registro e a imagem permanecem para reativação.</w:t>
+              <w:t xml:space="preserve">Banner global inativo some imediatamente das páginas públicas onde apareceria; o registro e a imagem permanecem para reativação.</w:t>
             </w:r>
           </w:p>
         </w:tc>
@@ -2179,7 +2185,7 @@
                 <w:b/>
                 <w:sz w:val="19"/>
               </w:rPr>
-              <w:t>RN-BE-04</w:t>
+              <w:t xml:space="preserve">RN-BE-04</w:t>
             </w:r>
           </w:p>
         </w:tc>
@@ -2202,7 +2208,7 @@
               <w:rPr>
                 <w:sz w:val="19"/>
               </w:rPr>
-              <w:t>O link passa pela mesma validação dos banners comuns (somente http/https) e a imagem pela mesma rotina de upload.</w:t>
+              <w:t xml:space="preserve">O link passa pela mesma validação dos banners comuns (somente http/https) e a imagem pela mesma rotina de upload.</w:t>
             </w:r>
           </w:p>
         </w:tc>
@@ -2228,7 +2234,7 @@
                 <w:b/>
                 <w:sz w:val="19"/>
               </w:rPr>
-              <w:t>RN-BE-05</w:t>
+              <w:t xml:space="preserve">RN-BE-05</w:t>
             </w:r>
           </w:p>
         </w:tc>
@@ -2251,7 +2257,56 @@
               <w:rPr>
                 <w:sz w:val="19"/>
               </w:rPr>
-              <w:t>Banners globais independem de conta e campeonato: exclusões não os afetam e aparecem inclusive em campeonatos de contas com Banners bloqueados.</w:t>
+              <w:t xml:space="preserve">Banners globais independem de conta e campeonato para gestão (só o master edita; exclusões de contas/campeonatos não os afetam). A exibição, porém, é gated pelo tipo da conta DONA: só contas Padrão, inclusive quando a seção Banners dessa conta está bloqueada.</w:t>
+            </w:r>
+          </w:p>
+        </w:tc>
+      </w:tr>
+      <w:tr>
+        <w:tc>
+          <w:tcPr>
+            <w:tcW w:w="1500" w:type="dxa"/>
+            <w:tcBorders>
+              <w:top w:val="single" w:sz="4" w:space="0" w:color="CCCCCC"/>
+              <w:left w:val="single" w:sz="4" w:space="0" w:color="CCCCCC"/>
+              <w:bottom w:val="single" w:sz="4" w:space="0" w:color="CCCCCC"/>
+              <w:right w:val="single" w:sz="4" w:space="0" w:color="CCCCCC"/>
+            </w:tcBorders>
+            <w:vAlign w:val="center"/>
+          </w:tcPr>
+          <w:p>
+            <w:pPr>
+              <w:spacing w:before="40" w:after="40"/>
+            </w:pPr>
+            <w:r>
+              <w:rPr>
+                <w:b/>
+                <w:sz w:val="19"/>
+              </w:rPr>
+              <w:t xml:space="preserve">RN-BE-06</w:t>
+            </w:r>
+          </w:p>
+        </w:tc>
+        <w:tc>
+          <w:tcPr>
+            <w:tcW w:w="7850" w:type="dxa"/>
+            <w:tcBorders>
+              <w:top w:val="single" w:sz="4" w:space="0" w:color="CCCCCC"/>
+              <w:left w:val="single" w:sz="4" w:space="0" w:color="CCCCCC"/>
+              <w:bottom w:val="single" w:sz="4" w:space="0" w:color="CCCCCC"/>
+              <w:right w:val="single" w:sz="4" w:space="0" w:color="CCCCCC"/>
+            </w:tcBorders>
+            <w:vAlign w:val="center"/>
+          </w:tcPr>
+          <w:p>
+            <w:pPr>
+              <w:spacing w:before="40" w:after="40"/>
+            </w:pPr>
+            <w:r>
+              <w:rPr>
+                <w:sz w:val="19"/>
+              </w:rPr>
+              <w:t xml:space="preserve">O gate por plano é avaliado no tipo ATUAL da conta dona, em tempo de requisição: promover uma conta a Premium/Premium+ remove o Banner Especial dos campeonatos dela na hora; rebaixar para Padrão volta a exibi-lo. Não há dado gravado por campeonato.</w:t>
             </w:r>
           </w:p>
         </w:tc>
@@ -2262,7 +2317,7 @@
         <w:pStyle w:val="Heading3"/>
       </w:pPr>
       <w:r>
-        <w:t>7.4 Colaboradores (RN-CO)</w:t>
+        <w:t xml:space="preserve">7.4 Colaboradores (RN-CO)</w:t>
       </w:r>
     </w:p>
     <w:tbl>
@@ -2303,7 +2358,7 @@
                 <w:color w:val="FFFFFF"/>
                 <w:sz w:val="19"/>
               </w:rPr>
-              <w:t>Código</w:t>
+              <w:t xml:space="preserve">Código</w:t>
             </w:r>
           </w:p>
         </w:tc>
@@ -2329,7 +2384,7 @@
                 <w:color w:val="FFFFFF"/>
                 <w:sz w:val="19"/>
               </w:rPr>
-              <w:t>Regra</w:t>
+              <w:t xml:space="preserve">Regra</w:t>
             </w:r>
           </w:p>
         </w:tc>
@@ -2355,7 +2410,7 @@
                 <w:b/>
                 <w:sz w:val="19"/>
               </w:rPr>
-              <w:t>RN-CO-01</w:t>
+              <w:t xml:space="preserve">RN-CO-01</w:t>
             </w:r>
           </w:p>
         </w:tc>
@@ -2378,7 +2433,7 @@
               <w:rPr>
                 <w:sz w:val="19"/>
               </w:rPr>
-              <w:t>O dono pode compartilhar cada campeonato com até 2 colaboradores (convites pendentes contam). O 3º convite é recusado com 409.</w:t>
+              <w:t xml:space="preserve">O dono pode compartilhar cada campeonato com até 2 colaboradores (convites pendentes contam). O 3º convite é recusado com 409.</w:t>
             </w:r>
           </w:p>
         </w:tc>
@@ -2404,7 +2459,7 @@
                 <w:b/>
                 <w:sz w:val="19"/>
               </w:rPr>
-              <w:t>RN-CO-02</w:t>
+              <w:t xml:space="preserve">RN-CO-02</w:t>
             </w:r>
           </w:p>
         </w:tc>
@@ -2427,7 +2482,7 @@
               <w:rPr>
                 <w:sz w:val="19"/>
               </w:rPr>
-              <w:t>O convite é por e-mail. E-mail com conta: vínculo ativo imediato. Sem conta: pendente, ativado quando a pessoa criar a conta com aquele e-mail E confirmá-lo (ou entrar via Google). Pendente não dá acesso algum.</w:t>
+              <w:t xml:space="preserve">O convite é por e-mail. E-mail com conta: vínculo ativo imediato. Sem conta: pendente, ativado quando a pessoa criar a conta com aquele e-mail E confirmá-lo (ou entrar via Google). Pendente não dá acesso algum.</w:t>
             </w:r>
           </w:p>
         </w:tc>
@@ -2453,7 +2508,7 @@
                 <w:b/>
                 <w:sz w:val="19"/>
               </w:rPr>
-              <w:t>RN-CO-03</w:t>
+              <w:t xml:space="preserve">RN-CO-03</w:t>
             </w:r>
           </w:p>
         </w:tc>
@@ -2476,7 +2531,7 @@
               <w:rPr>
                 <w:sz w:val="19"/>
               </w:rPr>
-              <w:t>Flags por colaborador: Jogos, Times, Regras e Sorteio (somente Pelada Épica; nos demais esportes, erro 400). O dono edita as flags a qualquer momento, com efeito imediato.</w:t>
+              <w:t xml:space="preserve">Flags por colaborador: Jogos, Times, Regras e Sorteio (somente Pelada Épica; nos demais esportes, erro 400). O dono edita as flags a qualquer momento, com efeito imediato.</w:t>
             </w:r>
           </w:p>
         </w:tc>
@@ -2502,7 +2557,7 @@
                 <w:b/>
                 <w:sz w:val="19"/>
               </w:rPr>
-              <w:t>RN-CO-04</w:t>
+              <w:t xml:space="preserve">RN-CO-04</w:t>
             </w:r>
           </w:p>
         </w:tc>
@@ -2525,7 +2580,7 @@
               <w:rPr>
                 <w:sz w:val="19"/>
               </w:rPr>
-              <w:t>Todo colaborador (qualquer flag) vê o campeonato em leitura, incluindo a Classificação.</w:t>
+              <w:t xml:space="preserve">Todo colaborador (qualquer flag) vê o campeonato em leitura, incluindo a Classificação.</w:t>
             </w:r>
           </w:p>
         </w:tc>
@@ -2551,7 +2606,7 @@
                 <w:b/>
                 <w:sz w:val="19"/>
               </w:rPr>
-              <w:t>RN-CO-05</w:t>
+              <w:t xml:space="preserve">RN-CO-05</w:t>
             </w:r>
           </w:p>
         </w:tc>
@@ -2574,7 +2629,7 @@
               <w:rPr>
                 <w:sz w:val="19"/>
               </w:rPr>
-              <w:t>Colaborador nunca acessa: Configurações (editar/excluir/logo), Banners, gerar mata-mata e gestão de colaboradores. Tentativa: 403 "Você não tem acesso a esta seção."</w:t>
+              <w:t xml:space="preserve">Colaborador nunca acessa: Configurações (editar/excluir/logo), Banners, gerar mata-mata e gestão de colaboradores. Tentativa: 403 "Você não tem acesso a esta seção."</w:t>
             </w:r>
           </w:p>
         </w:tc>
@@ -2600,7 +2655,7 @@
                 <w:b/>
                 <w:sz w:val="19"/>
               </w:rPr>
-              <w:t>RN-CO-06</w:t>
+              <w:t xml:space="preserve">RN-CO-06</w:t>
             </w:r>
           </w:p>
         </w:tc>
@@ -2623,7 +2678,7 @@
               <w:rPr>
                 <w:sz w:val="19"/>
               </w:rPr>
-              <w:t>Quem não tem vínculo nenhum segue recebendo 404 genérico (anti-enumeração preservada).</w:t>
+              <w:t xml:space="preserve">Quem não tem vínculo nenhum segue recebendo 404 genérico (anti-enumeração preservada).</w:t>
             </w:r>
           </w:p>
         </w:tc>
@@ -2649,7 +2704,7 @@
                 <w:b/>
                 <w:sz w:val="19"/>
               </w:rPr>
-              <w:t>RN-CO-07</w:t>
+              <w:t xml:space="preserve">RN-CO-07</w:t>
             </w:r>
           </w:p>
         </w:tc>
@@ -2672,7 +2727,7 @@
               <w:rPr>
                 <w:sz w:val="19"/>
               </w:rPr>
-              <w:t>Campeonatos compartilhados aparecem na lista do colaborador em seção própria ("Compartilhados comigo", com o nome do dono) e não contam no limite dele.</w:t>
+              <w:t xml:space="preserve">Campeonatos compartilhados aparecem na lista do colaborador em seção própria ("Compartilhados comigo", com o nome do dono) e não contam no limite dele.</w:t>
             </w:r>
           </w:p>
         </w:tc>
@@ -2698,7 +2753,7 @@
                 <w:b/>
                 <w:sz w:val="19"/>
               </w:rPr>
-              <w:t>RN-CO-08</w:t>
+              <w:t xml:space="preserve">RN-CO-08</w:t>
             </w:r>
           </w:p>
         </w:tc>
@@ -2721,7 +2776,7 @@
               <w:rPr>
                 <w:sz w:val="19"/>
               </w:rPr>
-              <w:t>Colaborador removido perde o acesso na requisição seguinte; o campeonato some da lista dele. Nada fica em sessão.</w:t>
+              <w:t xml:space="preserve">Colaborador removido perde o acesso na requisição seguinte; o campeonato some da lista dele. Nada fica em sessão.</w:t>
             </w:r>
           </w:p>
         </w:tc>
@@ -2747,7 +2802,7 @@
                 <w:b/>
                 <w:sz w:val="19"/>
               </w:rPr>
-              <w:t>RN-CO-09</w:t>
+              <w:t xml:space="preserve">RN-CO-09</w:t>
             </w:r>
           </w:p>
         </w:tc>
@@ -2770,7 +2825,7 @@
               <w:rPr>
                 <w:sz w:val="19"/>
               </w:rPr>
-              <w:t>Conta do colaborador excluída ou campeonato excluído: vínculos somem em cascata. Convite pendente de e-mail que nunca criou conta permanece até o dono cancelar.</w:t>
+              <w:t xml:space="preserve">Conta do colaborador excluída ou campeonato excluído: vínculos somem em cascata. Convite pendente de e-mail que nunca criou conta permanece até o dono cancelar.</w:t>
             </w:r>
           </w:p>
         </w:tc>
@@ -2796,7 +2851,7 @@
                 <w:b/>
                 <w:sz w:val="19"/>
               </w:rPr>
-              <w:t>RN-CO-10</w:t>
+              <w:t xml:space="preserve">RN-CO-10</w:t>
             </w:r>
           </w:p>
         </w:tc>
@@ -2819,7 +2874,7 @@
               <w:rPr>
                 <w:sz w:val="19"/>
               </w:rPr>
-              <w:t>O dono não pode convidar o próprio e-mail (400) nem repetir e-mail no mesmo campeonato (409).</w:t>
+              <w:t xml:space="preserve">O dono não pode convidar o próprio e-mail (400) nem repetir e-mail no mesmo campeonato (409).</w:t>
             </w:r>
           </w:p>
         </w:tc>
@@ -2845,8 +2900,7 @@
                 <w:b/>
                 <w:sz w:val="19"/>
               </w:rPr>
-              <w:lastRenderedPageBreak/>
-              <w:t>RN-CO-11</w:t>
+              <w:t xml:space="preserve">RN-CO-11</w:t>
             </w:r>
           </w:p>
         </w:tc>
@@ -2869,7 +2923,7 @@
               <w:rPr>
                 <w:sz w:val="19"/>
               </w:rPr>
-              <w:t>O convite dispara e-mail (Brevo); falha de envio não desfaz o convite (mesmo contrato do e-mail de verificação).</w:t>
+              <w:t xml:space="preserve">O convite dispara e-mail (Brevo); falha de envio não desfaz o convite (mesmo contrato do e-mail de verificação).</w:t>
             </w:r>
           </w:p>
         </w:tc>
@@ -2895,7 +2949,7 @@
                 <w:b/>
                 <w:sz w:val="19"/>
               </w:rPr>
-              <w:t>RN-CO-12</w:t>
+              <w:t xml:space="preserve">RN-CO-12</w:t>
             </w:r>
           </w:p>
         </w:tc>
@@ -2918,7 +2972,7 @@
               <w:rPr>
                 <w:sz w:val="19"/>
               </w:rPr>
-              <w:t>Decisão registrada: a resposta ao dono distingue pendente/ativo (sinal leve de existência de conta), mitigada por login obrigatório + rate limit de convites + teto de 2 por campeonato.</w:t>
+              <w:t xml:space="preserve">Decisão registrada: a resposta ao dono distingue pendente/ativo (sinal leve de existência de conta), mitigada por login obrigatório + rate limit de convites + teto de 2 por campeonato.</w:t>
             </w:r>
           </w:p>
         </w:tc>
@@ -2944,7 +2998,7 @@
                 <w:b/>
                 <w:sz w:val="19"/>
               </w:rPr>
-              <w:t>RN-CO-13</w:t>
+              <w:t xml:space="preserve">RN-CO-13</w:t>
             </w:r>
           </w:p>
         </w:tc>
@@ -2967,7 +3021,7 @@
               <w:rPr>
                 <w:sz w:val="19"/>
               </w:rPr>
-              <w:t>Limites de estrutura nas ações do colaborador seguem a conta dona (RN-GC-08).</w:t>
+              <w:t xml:space="preserve">Limites de estrutura nas ações do colaborador seguem a conta dona (RN-GC-08).</w:t>
             </w:r>
           </w:p>
         </w:tc>
@@ -2978,7 +3032,7 @@
         <w:pStyle w:val="Heading3"/>
       </w:pPr>
       <w:r>
-        <w:t>7.5 Esqueci minha senha (RN-ES)</w:t>
+        <w:t xml:space="preserve">7.5 Esqueci minha senha (RN-ES)</w:t>
       </w:r>
     </w:p>
     <w:tbl>
@@ -3019,7 +3073,7 @@
                 <w:color w:val="FFFFFF"/>
                 <w:sz w:val="19"/>
               </w:rPr>
-              <w:t>Código</w:t>
+              <w:t xml:space="preserve">Código</w:t>
             </w:r>
           </w:p>
         </w:tc>
@@ -3045,7 +3099,7 @@
                 <w:color w:val="FFFFFF"/>
                 <w:sz w:val="19"/>
               </w:rPr>
-              <w:t>Regra</w:t>
+              <w:t xml:space="preserve">Regra</w:t>
             </w:r>
           </w:p>
         </w:tc>
@@ -3071,7 +3125,7 @@
                 <w:b/>
                 <w:sz w:val="19"/>
               </w:rPr>
-              <w:t>RN-ES-01</w:t>
+              <w:t xml:space="preserve">RN-ES-01</w:t>
             </w:r>
           </w:p>
         </w:tc>
@@ -3094,7 +3148,7 @@
               <w:rPr>
                 <w:sz w:val="19"/>
               </w:rPr>
-              <w:t>O pedido de redefinição responde sempre com a mesma mensagem (anti-enumeração). Rate limit próprio: 5 pedidos/15min por IP.</w:t>
+              <w:t xml:space="preserve">O pedido de redefinição responde sempre com a mesma mensagem (anti-enumeração). Rate limit próprio: 5 pedidos/15min por IP.</w:t>
             </w:r>
           </w:p>
         </w:tc>
@@ -3120,7 +3174,7 @@
                 <w:b/>
                 <w:sz w:val="19"/>
               </w:rPr>
-              <w:t>RN-ES-02</w:t>
+              <w:t xml:space="preserve">RN-ES-02</w:t>
             </w:r>
           </w:p>
         </w:tc>
@@ -3143,7 +3197,7 @@
               <w:rPr>
                 <w:sz w:val="19"/>
               </w:rPr>
-              <w:t>Token aleatório de 32 bytes; apenas o hash sha-256 vai ao banco; validade de 1 hora; uso único; pedir novo link invalida os pendentes.</w:t>
+              <w:t xml:space="preserve">Token aleatório de 32 bytes; apenas o hash sha-256 vai ao banco; validade de 1 hora; uso único; pedir novo link invalida os pendentes.</w:t>
             </w:r>
           </w:p>
         </w:tc>
@@ -3169,7 +3223,7 @@
                 <w:b/>
                 <w:sz w:val="19"/>
               </w:rPr>
-              <w:t>RN-ES-03</w:t>
+              <w:t xml:space="preserve">RN-ES-03</w:t>
             </w:r>
           </w:p>
         </w:tc>
@@ -3192,7 +3246,7 @@
               <w:rPr>
                 <w:sz w:val="19"/>
               </w:rPr>
-              <w:t>O link enviado aponta para a página de redefinição do próprio domínio (redefinir.html?token=...).</w:t>
+              <w:t xml:space="preserve">O link enviado aponta para a página de redefinição do próprio domínio (redefinir.html?token=...).</w:t>
             </w:r>
           </w:p>
         </w:tc>
@@ -3218,7 +3272,7 @@
                 <w:b/>
                 <w:sz w:val="19"/>
               </w:rPr>
-              <w:t>RN-ES-04</w:t>
+              <w:t xml:space="preserve">RN-ES-04</w:t>
             </w:r>
           </w:p>
         </w:tc>
@@ -3241,7 +3295,7 @@
               <w:rPr>
                 <w:sz w:val="19"/>
               </w:rPr>
-              <w:t>A redefinição valida a senha com as mesmas regras do registro (6–200). Token inválido/usado: 400 "Link de redefinição inválido ou já usado. Peça um novo." Expirado: 400 "Este link expirou. Peça um novo na tela de login."</w:t>
+              <w:t xml:space="preserve">A redefinição valida a senha com as mesmas regras do registro (6–200). Token inválido/usado: 400 "Link de redefinição inválido ou já usado. Peça um novo." Expirado: 400 "Este link expirou. Peça um novo na tela de login."</w:t>
             </w:r>
           </w:p>
         </w:tc>
@@ -3267,7 +3321,7 @@
                 <w:b/>
                 <w:sz w:val="19"/>
               </w:rPr>
-              <w:t>RN-ES-05</w:t>
+              <w:t xml:space="preserve">RN-ES-05</w:t>
             </w:r>
           </w:p>
         </w:tc>
@@ -3290,7 +3344,7 @@
               <w:rPr>
                 <w:sz w:val="19"/>
               </w:rPr>
-              <w:t>Ao redefinir: grava a senha nova, marca o token como usado, derruba TODAS as sessões da conta e abre uma sessão nova (a pessoa cai logada no painel).</w:t>
+              <w:t xml:space="preserve">Ao redefinir: grava a senha nova, marca o token como usado, derruba TODAS as sessões da conta e abre uma sessão nova (a pessoa cai logada no painel).</w:t>
             </w:r>
           </w:p>
         </w:tc>
@@ -3316,7 +3370,7 @@
                 <w:b/>
                 <w:sz w:val="19"/>
               </w:rPr>
-              <w:t>RN-ES-06</w:t>
+              <w:t xml:space="preserve">RN-ES-06</w:t>
             </w:r>
           </w:p>
         </w:tc>
@@ -3339,7 +3393,7 @@
               <w:rPr>
                 <w:sz w:val="19"/>
               </w:rPr>
-              <w:t>Conta que só usa Google (sem senha): a resposta é a padrão, mas o e-mail é informativo ("Sua conta usa o Login com Google") e nenhum token é gerado. Conta Google vinculada que já tinha senha redefine normalmente.</w:t>
+              <w:t xml:space="preserve">Conta que só usa Google (sem senha): a resposta é a padrão, mas o e-mail é informativo ("Sua conta usa o Login com Google") e nenhum token é gerado. Conta Google vinculada que já tinha senha redefine normalmente.</w:t>
             </w:r>
           </w:p>
         </w:tc>
@@ -3365,7 +3419,7 @@
                 <w:b/>
                 <w:sz w:val="19"/>
               </w:rPr>
-              <w:t>RN-ES-07</w:t>
+              <w:t xml:space="preserve">RN-ES-07</w:t>
             </w:r>
           </w:p>
         </w:tc>
@@ -3388,7 +3442,7 @@
               <w:rPr>
                 <w:sz w:val="19"/>
               </w:rPr>
-              <w:t>E-mail sem conta: nenhuma ação além da resposta padrão (nem e-mail).</w:t>
+              <w:t xml:space="preserve">E-mail sem conta: nenhuma ação além da resposta padrão (nem e-mail).</w:t>
             </w:r>
           </w:p>
         </w:tc>
@@ -3414,7 +3468,7 @@
                 <w:b/>
                 <w:sz w:val="19"/>
               </w:rPr>
-              <w:t>RN-ES-08</w:t>
+              <w:t xml:space="preserve">RN-ES-08</w:t>
             </w:r>
           </w:p>
         </w:tc>
@@ -3437,7 +3491,7 @@
               <w:rPr>
                 <w:sz w:val="19"/>
               </w:rPr>
-              <w:t>Redefinir senha não confirma e-mail pendente: os fluxos são independentes.</w:t>
+              <w:t xml:space="preserve">Redefinir senha não confirma e-mail pendente: os fluxos são independentes.</w:t>
             </w:r>
           </w:p>
         </w:tc>
@@ -3448,7 +3502,7 @@
         <w:pStyle w:val="Heading1"/>
       </w:pPr>
       <w:r>
-        <w:t>8. Modelo de dados e API</w:t>
+        <w:t xml:space="preserve">8. Modelo de dados e API</w:t>
       </w:r>
     </w:p>
     <w:p>
@@ -3462,7 +3516,7 @@
         <w:rPr>
           <w:b/>
         </w:rPr>
-        <w:t>Colunas novas em contas:</w:t>
+        <w:t xml:space="preserve">Colunas novas em contas:</w:t>
       </w:r>
       <w:r>
         <w:t xml:space="preserve"> tipo (padrão/premium/premium+), máx. de campeonatos, máx. de times, máx. de jogadores por time (os três NULL = padrão do tipo/global) e flag de Banners liberados. Migração aditiva com backfill único do grandfather (mesmo padrão já usado na verificação de e-mail).</w:t>
@@ -3479,7 +3533,7 @@
         <w:rPr>
           <w:b/>
         </w:rPr>
-        <w:t>Tabelas novas:</w:t>
+        <w:t xml:space="preserve">Tabelas novas:</w:t>
       </w:r>
       <w:r>
         <w:t xml:space="preserve"> colaboradores (campeonato, conta opcional = pendente, e-mail, 4 flags, único por campeonato+e-mail), banners_globais (imagem, link, ordem, ativo — sem vínculo com campeonato) e recuperacoes_senha (espelho estrutural da verificação de e-mail).</w:t>
@@ -3496,7 +3550,7 @@
         <w:rPr>
           <w:b/>
         </w:rPr>
-        <w:t>Posse preservada:</w:t>
+        <w:t xml:space="preserve">Posse preservada:</w:t>
       </w:r>
       <w:r>
         <w:t xml:space="preserve"> as validações atuais de posse (dono-only) não mudam; o acesso de colaborador entra por funções novas em paralelo ("campeonato com acesso à seção X"), usadas apenas nas rotas das seções compartilháveis. A aba Regras passa a salvar por rota dedicada, para o colaborador de Regras não precisar da rota geral de configuração.</w:t>
@@ -3513,7 +3567,7 @@
         <w:rPr>
           <w:b/>
         </w:rPr>
-        <w:t>Payload do campeonato:</w:t>
+        <w:t xml:space="preserve">Payload do campeonato:</w:t>
       </w:r>
       <w:r>
         <w:t xml:space="preserve"> ganha o bloco meu_acesso (dono, jogos, times, regras, sorteio, banners, config) que dirige as abas do painel; colaborador não recebe os dados de banners nem a lista de colaboradores. A lista de campeonatos passa a incluir os compartilhados, marcados, sem mudar o formato atual.</w:t>
@@ -3524,7 +3578,7 @@
         <w:pStyle w:val="Heading3"/>
       </w:pPr>
       <w:r>
-        <w:t>Rotas novas e alteradas</w:t>
+        <w:t xml:space="preserve">Rotas novas e alteradas</w:t>
       </w:r>
     </w:p>
     <w:tbl>
@@ -3567,7 +3621,7 @@
                 <w:color w:val="FFFFFF"/>
                 <w:sz w:val="19"/>
               </w:rPr>
-              <w:t>Método</w:t>
+              <w:t xml:space="preserve">Método</w:t>
             </w:r>
           </w:p>
         </w:tc>
@@ -3593,7 +3647,7 @@
                 <w:color w:val="FFFFFF"/>
                 <w:sz w:val="19"/>
               </w:rPr>
-              <w:t>Caminho</w:t>
+              <w:t xml:space="preserve">Caminho</w:t>
             </w:r>
           </w:p>
         </w:tc>
@@ -3619,7 +3673,7 @@
                 <w:color w:val="FFFFFF"/>
                 <w:sz w:val="19"/>
               </w:rPr>
-              <w:t>Acesso</w:t>
+              <w:t xml:space="preserve">Acesso</w:t>
             </w:r>
           </w:p>
         </w:tc>
@@ -3645,7 +3699,7 @@
                 <w:color w:val="FFFFFF"/>
                 <w:sz w:val="19"/>
               </w:rPr>
-              <w:t>Mudança</w:t>
+              <w:t xml:space="preserve">Mudança</w:t>
             </w:r>
           </w:p>
         </w:tc>
@@ -3670,7 +3724,7 @@
               <w:rPr>
                 <w:sz w:val="19"/>
               </w:rPr>
-              <w:t>POST</w:t>
+              <w:t xml:space="preserve">POST</w:t>
             </w:r>
           </w:p>
         </w:tc>
@@ -3693,7 +3747,7 @@
               <w:rPr>
                 <w:sz w:val="19"/>
               </w:rPr>
-              <w:t>/api/auth/esqueci-senha</w:t>
+              <w:t xml:space="preserve">/api/auth/esqueci-senha</w:t>
             </w:r>
           </w:p>
         </w:tc>
@@ -3716,7 +3770,7 @@
               <w:rPr>
                 <w:sz w:val="19"/>
               </w:rPr>
-              <w:t>público (rate limit)</w:t>
+              <w:t xml:space="preserve">público (rate limit)</w:t>
             </w:r>
           </w:p>
         </w:tc>
@@ -3739,7 +3793,7 @@
               <w:rPr>
                 <w:sz w:val="19"/>
               </w:rPr>
-              <w:t>nova</w:t>
+              <w:t xml:space="preserve">nova</w:t>
             </w:r>
           </w:p>
         </w:tc>
@@ -3764,7 +3818,7 @@
               <w:rPr>
                 <w:sz w:val="19"/>
               </w:rPr>
-              <w:t>POST</w:t>
+              <w:t xml:space="preserve">POST</w:t>
             </w:r>
           </w:p>
         </w:tc>
@@ -3787,7 +3841,7 @@
               <w:rPr>
                 <w:sz w:val="19"/>
               </w:rPr>
-              <w:t>/api/auth/redefinir-senha</w:t>
+              <w:t xml:space="preserve">/api/auth/redefinir-senha</w:t>
             </w:r>
           </w:p>
         </w:tc>
@@ -3810,7 +3864,7 @@
               <w:rPr>
                 <w:sz w:val="19"/>
               </w:rPr>
-              <w:t>público (rate limit)</w:t>
+              <w:t xml:space="preserve">público (rate limit)</w:t>
             </w:r>
           </w:p>
         </w:tc>
@@ -3833,7 +3887,7 @@
               <w:rPr>
                 <w:sz w:val="19"/>
               </w:rPr>
-              <w:t>nova</w:t>
+              <w:t xml:space="preserve">nova</w:t>
             </w:r>
           </w:p>
         </w:tc>
@@ -3858,7 +3912,7 @@
               <w:rPr>
                 <w:sz w:val="19"/>
               </w:rPr>
-              <w:t>GET</w:t>
+              <w:t xml:space="preserve">GET</w:t>
             </w:r>
           </w:p>
         </w:tc>
@@ -3881,7 +3935,7 @@
               <w:rPr>
                 <w:sz w:val="19"/>
               </w:rPr>
-              <w:t>/api/conta/limites</w:t>
+              <w:t xml:space="preserve">/api/conta/limites</w:t>
             </w:r>
           </w:p>
         </w:tc>
@@ -3904,7 +3958,7 @@
               <w:rPr>
                 <w:sz w:val="19"/>
               </w:rPr>
-              <w:t>logado</w:t>
+              <w:t xml:space="preserve">logado</w:t>
             </w:r>
           </w:p>
         </w:tc>
@@ -3927,7 +3981,7 @@
               <w:rPr>
                 <w:sz w:val="19"/>
               </w:rPr>
-              <w:t>nova — consumo e tetos</w:t>
+              <w:t xml:space="preserve">nova — consumo e tetos</w:t>
             </w:r>
           </w:p>
         </w:tc>
@@ -3952,8 +4006,7 @@
               <w:rPr>
                 <w:sz w:val="19"/>
               </w:rPr>
-              <w:lastRenderedPageBreak/>
-              <w:t>GET</w:t>
+              <w:t xml:space="preserve">GET</w:t>
             </w:r>
           </w:p>
         </w:tc>
@@ -3976,7 +4029,7 @@
               <w:rPr>
                 <w:sz w:val="19"/>
               </w:rPr>
-              <w:t>/api/campeonatos</w:t>
+              <w:t xml:space="preserve">/api/campeonatos</w:t>
             </w:r>
           </w:p>
         </w:tc>
@@ -3999,7 +4052,7 @@
               <w:rPr>
                 <w:sz w:val="19"/>
               </w:rPr>
-              <w:t>logado</w:t>
+              <w:t xml:space="preserve">logado</w:t>
             </w:r>
           </w:p>
         </w:tc>
@@ -4022,7 +4075,7 @@
               <w:rPr>
                 <w:sz w:val="19"/>
               </w:rPr>
-              <w:t>inclui compartilhados</w:t>
+              <w:t xml:space="preserve">inclui compartilhados</w:t>
             </w:r>
           </w:p>
         </w:tc>
@@ -4047,7 +4100,7 @@
               <w:rPr>
                 <w:sz w:val="19"/>
               </w:rPr>
-              <w:t>POST</w:t>
+              <w:t xml:space="preserve">POST</w:t>
             </w:r>
           </w:p>
         </w:tc>
@@ -4070,7 +4123,7 @@
               <w:rPr>
                 <w:sz w:val="19"/>
               </w:rPr>
-              <w:t>/api/campeonatos</w:t>
+              <w:t xml:space="preserve">/api/campeonatos</w:t>
             </w:r>
           </w:p>
         </w:tc>
@@ -4093,7 +4146,7 @@
               <w:rPr>
                 <w:sz w:val="19"/>
               </w:rPr>
-              <w:t>dono</w:t>
+              <w:t xml:space="preserve">dono</w:t>
             </w:r>
           </w:p>
         </w:tc>
@@ -4116,7 +4169,7 @@
               <w:rPr>
                 <w:sz w:val="19"/>
               </w:rPr>
-              <w:t>valida limites</w:t>
+              <w:t xml:space="preserve">valida limites</w:t>
             </w:r>
           </w:p>
         </w:tc>
@@ -4141,7 +4194,7 @@
               <w:rPr>
                 <w:sz w:val="19"/>
               </w:rPr>
-              <w:t>GET</w:t>
+              <w:t xml:space="preserve">GET</w:t>
             </w:r>
           </w:p>
         </w:tc>
@@ -4164,7 +4217,7 @@
               <w:rPr>
                 <w:sz w:val="19"/>
               </w:rPr>
-              <w:t>/api/campeonatos/:id</w:t>
+              <w:t xml:space="preserve">/api/campeonatos/:id</w:t>
             </w:r>
           </w:p>
         </w:tc>
@@ -4187,7 +4240,7 @@
               <w:rPr>
                 <w:sz w:val="19"/>
               </w:rPr>
-              <w:t>dono ou colaborador</w:t>
+              <w:t xml:space="preserve">dono ou colaborador</w:t>
             </w:r>
           </w:p>
         </w:tc>
@@ -4210,7 +4263,7 @@
               <w:rPr>
                 <w:sz w:val="19"/>
               </w:rPr>
-              <w:t>bloco meu_acesso</w:t>
+              <w:t xml:space="preserve">bloco meu_acesso</w:t>
             </w:r>
           </w:p>
         </w:tc>
@@ -4235,7 +4288,7 @@
               <w:rPr>
                 <w:sz w:val="19"/>
               </w:rPr>
-              <w:t>PATCH</w:t>
+              <w:t xml:space="preserve">PATCH</w:t>
             </w:r>
           </w:p>
         </w:tc>
@@ -4258,7 +4311,7 @@
               <w:rPr>
                 <w:sz w:val="19"/>
               </w:rPr>
-              <w:t>/api/campeonatos/:id/regras</w:t>
+              <w:t xml:space="preserve">/api/campeonatos/:id/regras</w:t>
             </w:r>
           </w:p>
         </w:tc>
@@ -4281,7 +4334,7 @@
               <w:rPr>
                 <w:sz w:val="19"/>
               </w:rPr>
-              <w:t>dono ou flag Regras</w:t>
+              <w:t xml:space="preserve">dono ou flag Regras</w:t>
             </w:r>
           </w:p>
         </w:tc>
@@ -4304,7 +4357,7 @@
               <w:rPr>
                 <w:sz w:val="19"/>
               </w:rPr>
-              <w:t>nova (dedicada)</w:t>
+              <w:t xml:space="preserve">nova (dedicada)</w:t>
             </w:r>
           </w:p>
         </w:tc>
@@ -4329,7 +4382,7 @@
               <w:rPr>
                 <w:sz w:val="19"/>
               </w:rPr>
-              <w:t>POST/PATCH/DELETE</w:t>
+              <w:t xml:space="preserve">POST/PATCH/DELETE</w:t>
             </w:r>
           </w:p>
         </w:tc>
@@ -4352,7 +4405,7 @@
               <w:rPr>
                 <w:sz w:val="19"/>
               </w:rPr>
-              <w:t>/api/campeonatos/:id/colaboradores</w:t>
+              <w:t xml:space="preserve">/api/campeonatos/:id/colaboradores</w:t>
             </w:r>
           </w:p>
         </w:tc>
@@ -4375,7 +4428,7 @@
               <w:rPr>
                 <w:sz w:val="19"/>
               </w:rPr>
-              <w:t>dono</w:t>
+              <w:t xml:space="preserve">dono</w:t>
             </w:r>
           </w:p>
         </w:tc>
@@ -4398,7 +4451,7 @@
               <w:rPr>
                 <w:sz w:val="19"/>
               </w:rPr>
-              <w:t>novas — convite/flags</w:t>
+              <w:t xml:space="preserve">novas — convite/flags</w:t>
             </w:r>
           </w:p>
         </w:tc>
@@ -4423,7 +4476,7 @@
               <w:rPr>
                 <w:sz w:val="19"/>
               </w:rPr>
-              <w:t>POST</w:t>
+              <w:t xml:space="preserve">POST</w:t>
             </w:r>
           </w:p>
         </w:tc>
@@ -4446,7 +4499,7 @@
               <w:rPr>
                 <w:sz w:val="19"/>
               </w:rPr>
-              <w:t>/api/campeonatos/:id/banners</w:t>
+              <w:t xml:space="preserve">/api/campeonatos/:id/banners</w:t>
             </w:r>
           </w:p>
         </w:tc>
@@ -4469,7 +4522,7 @@
               <w:rPr>
                 <w:sz w:val="19"/>
               </w:rPr>
-              <w:t>dono com flag</w:t>
+              <w:t xml:space="preserve">dono com flag</w:t>
             </w:r>
           </w:p>
         </w:tc>
@@ -4492,7 +4545,7 @@
               <w:rPr>
                 <w:sz w:val="19"/>
               </w:rPr>
-              <w:t>gate por conta</w:t>
+              <w:t xml:space="preserve">gate por conta</w:t>
             </w:r>
           </w:p>
         </w:tc>
@@ -4517,7 +4570,7 @@
               <w:rPr>
                 <w:sz w:val="19"/>
               </w:rPr>
-              <w:t>(12 rotas)</w:t>
+              <w:t xml:space="preserve">(12 rotas)</w:t>
             </w:r>
           </w:p>
         </w:tc>
@@ -4540,7 +4593,7 @@
               <w:rPr>
                 <w:sz w:val="19"/>
               </w:rPr>
-              <w:t>jogos, times, jogadores, sorteio</w:t>
+              <w:t xml:space="preserve">jogos, times, jogadores, sorteio</w:t>
             </w:r>
           </w:p>
         </w:tc>
@@ -4563,7 +4616,7 @@
               <w:rPr>
                 <w:sz w:val="19"/>
               </w:rPr>
-              <w:t>dono ou flag da seção</w:t>
+              <w:t xml:space="preserve">dono ou flag da seção</w:t>
             </w:r>
           </w:p>
         </w:tc>
@@ -4586,7 +4639,7 @@
               <w:rPr>
                 <w:sz w:val="19"/>
               </w:rPr>
-              <w:t>aceitam colaborador</w:t>
+              <w:t xml:space="preserve">aceitam colaborador</w:t>
             </w:r>
           </w:p>
         </w:tc>
@@ -4611,7 +4664,7 @@
               <w:rPr>
                 <w:sz w:val="19"/>
               </w:rPr>
-              <w:t>GET/PATCH</w:t>
+              <w:t xml:space="preserve">GET/PATCH</w:t>
             </w:r>
           </w:p>
         </w:tc>
@@ -4634,7 +4687,7 @@
               <w:rPr>
                 <w:sz w:val="19"/>
               </w:rPr>
-              <w:t>/api/master/contas</w:t>
+              <w:t xml:space="preserve">/api/master/contas</w:t>
             </w:r>
           </w:p>
         </w:tc>
@@ -4657,7 +4710,7 @@
               <w:rPr>
                 <w:sz w:val="19"/>
               </w:rPr>
-              <w:t>master</w:t>
+              <w:t xml:space="preserve">master</w:t>
             </w:r>
           </w:p>
         </w:tc>
@@ -4680,7 +4733,7 @@
               <w:rPr>
                 <w:sz w:val="19"/>
               </w:rPr>
-              <w:t>tipo, overrides, flag</w:t>
+              <w:t xml:space="preserve">tipo, overrides, flag</w:t>
             </w:r>
           </w:p>
         </w:tc>
@@ -4705,7 +4758,7 @@
               <w:rPr>
                 <w:sz w:val="19"/>
               </w:rPr>
-              <w:t>CRUD</w:t>
+              <w:t xml:space="preserve">CRUD</w:t>
             </w:r>
           </w:p>
         </w:tc>
@@ -4728,7 +4781,7 @@
               <w:rPr>
                 <w:sz w:val="19"/>
               </w:rPr>
-              <w:t>/api/master/banners-globais</w:t>
+              <w:t xml:space="preserve">/api/master/banners-globais</w:t>
             </w:r>
           </w:p>
         </w:tc>
@@ -4751,7 +4804,7 @@
               <w:rPr>
                 <w:sz w:val="19"/>
               </w:rPr>
-              <w:t>master</w:t>
+              <w:t xml:space="preserve">master</w:t>
             </w:r>
           </w:p>
         </w:tc>
@@ -4774,7 +4827,7 @@
               <w:rPr>
                 <w:sz w:val="19"/>
               </w:rPr>
-              <w:t>novas — até 3</w:t>
+              <w:t xml:space="preserve">novas — até 3</w:t>
             </w:r>
           </w:p>
         </w:tc>
@@ -4799,7 +4852,7 @@
               <w:rPr>
                 <w:sz w:val="19"/>
               </w:rPr>
-              <w:t>GET</w:t>
+              <w:t xml:space="preserve">GET</w:t>
             </w:r>
           </w:p>
         </w:tc>
@@ -4822,7 +4875,7 @@
               <w:rPr>
                 <w:sz w:val="19"/>
               </w:rPr>
-              <w:t>/api/publico/:slug</w:t>
+              <w:t xml:space="preserve">/api/publico/:slug</w:t>
             </w:r>
           </w:p>
         </w:tc>
@@ -4845,7 +4898,7 @@
               <w:rPr>
                 <w:sz w:val="19"/>
               </w:rPr>
-              <w:t>público</w:t>
+              <w:t xml:space="preserve">público</w:t>
             </w:r>
           </w:p>
         </w:tc>
@@ -4868,7 +4921,7 @@
               <w:rPr>
                 <w:sz w:val="19"/>
               </w:rPr>
-              <w:t>banners globais no payload</w:t>
+              <w:t xml:space="preserve">banners globais no payload só se a conta dona for Padrão</w:t>
             </w:r>
           </w:p>
         </w:tc>
@@ -4879,7 +4932,7 @@
         <w:spacing w:before="40" w:after="80"/>
       </w:pPr>
       <w:r>
-        <w:t>Continuam exclusivas do dono, sem alteração: editar/excluir campeonato, logo, gerar mata-mata e o CRUD de banners do campeonato.</w:t>
+        <w:t xml:space="preserve">Continuam exclusivas do dono, sem alteração: editar/excluir campeonato, logo, gerar mata-mata e o CRUD de banners do campeonato.</w:t>
       </w:r>
     </w:p>
     <w:p>
@@ -4887,7 +4940,7 @@
         <w:pStyle w:val="Heading1"/>
       </w:pPr>
       <w:r>
-        <w:t>9. Fases de implementação sugeridas</w:t>
+        <w:t xml:space="preserve">9. Fases de implementação sugeridas</w:t>
       </w:r>
     </w:p>
     <w:tbl>
@@ -4930,7 +4983,7 @@
                 <w:color w:val="FFFFFF"/>
                 <w:sz w:val="19"/>
               </w:rPr>
-              <w:t>Fase</w:t>
+              <w:t xml:space="preserve">Fase</w:t>
             </w:r>
           </w:p>
         </w:tc>
@@ -4956,7 +5009,7 @@
                 <w:color w:val="FFFFFF"/>
                 <w:sz w:val="19"/>
               </w:rPr>
-              <w:t>Entrega</w:t>
+              <w:t xml:space="preserve">Entrega</w:t>
             </w:r>
           </w:p>
         </w:tc>
@@ -4982,7 +5035,7 @@
                 <w:color w:val="FFFFFF"/>
                 <w:sz w:val="19"/>
               </w:rPr>
-              <w:t>Escopo</w:t>
+              <w:t xml:space="preserve">Escopo</w:t>
             </w:r>
           </w:p>
         </w:tc>
@@ -5008,7 +5061,7 @@
                 <w:color w:val="FFFFFF"/>
                 <w:sz w:val="19"/>
               </w:rPr>
-              <w:t>Testes (est.)</w:t>
+              <w:t xml:space="preserve">Testes (est.)</w:t>
             </w:r>
           </w:p>
         </w:tc>
@@ -5033,7 +5086,7 @@
               <w:rPr>
                 <w:sz w:val="19"/>
               </w:rPr>
-              <w:t>1</w:t>
+              <w:t xml:space="preserve">1</w:t>
             </w:r>
           </w:p>
         </w:tc>
@@ -5056,7 +5109,7 @@
               <w:rPr>
                 <w:sz w:val="19"/>
               </w:rPr>
-              <w:t>Fundação de contas e limites</w:t>
+              <w:t xml:space="preserve">Fundação de contas e limites</w:t>
             </w:r>
           </w:p>
         </w:tc>
@@ -5079,7 +5132,7 @@
               <w:rPr>
                 <w:sz w:val="19"/>
               </w:rPr>
-              <w:t>Migração + módulo de limites + validações na criação de campeonatos/times/jogadores + painel master estendido + contador na lista</w:t>
+              <w:t xml:space="preserve">Migração + módulo de limites + validações na criação de campeonatos/times/jogadores + painel master estendido + contador na lista</w:t>
             </w:r>
           </w:p>
         </w:tc>
@@ -5102,7 +5155,7 @@
               <w:rPr>
                 <w:sz w:val="19"/>
               </w:rPr>
-              <w:t>~18</w:t>
+              <w:t xml:space="preserve">~18</w:t>
             </w:r>
           </w:p>
         </w:tc>
@@ -5127,7 +5180,7 @@
               <w:rPr>
                 <w:sz w:val="19"/>
               </w:rPr>
-              <w:t>2</w:t>
+              <w:t xml:space="preserve">2</w:t>
             </w:r>
           </w:p>
         </w:tc>
@@ -5150,7 +5203,7 @@
               <w:rPr>
                 <w:sz w:val="19"/>
               </w:rPr>
-              <w:t>Esqueci minha senha</w:t>
+              <w:t xml:space="preserve">Esqueci minha senha</w:t>
             </w:r>
           </w:p>
         </w:tc>
@@ -5173,7 +5226,7 @@
               <w:rPr>
                 <w:sz w:val="19"/>
               </w:rPr>
-              <w:t>Tabela de tokens + 2 rotas + rate limits + redefinir.html + link no login</w:t>
+              <w:t xml:space="preserve">Tabela de tokens + 2 rotas + rate limits + redefinir.html + link no login</w:t>
             </w:r>
           </w:p>
         </w:tc>
@@ -5196,7 +5249,7 @@
               <w:rPr>
                 <w:sz w:val="19"/>
               </w:rPr>
-              <w:t>~10</w:t>
+              <w:t xml:space="preserve">~10</w:t>
             </w:r>
           </w:p>
         </w:tc>
@@ -5221,7 +5274,7 @@
               <w:rPr>
                 <w:sz w:val="19"/>
               </w:rPr>
-              <w:t>3</w:t>
+              <w:t xml:space="preserve">3</w:t>
             </w:r>
           </w:p>
         </w:tc>
@@ -5244,7 +5297,7 @@
               <w:rPr>
                 <w:sz w:val="19"/>
               </w:rPr>
-              <w:t>Banners gated + Banner Especial</w:t>
+              <w:t xml:space="preserve">Banners gated + Banner Especial</w:t>
             </w:r>
           </w:p>
         </w:tc>
@@ -5267,7 +5320,7 @@
               <w:rPr>
                 <w:sz w:val="19"/>
               </w:rPr>
-              <w:t>Flag com grandfather + gate no servidor + CRUD master de banners globais + página pública</w:t>
+              <w:t xml:space="preserve">Flag com grandfather + gate no servidor + CRUD master de banners globais + gate de exibição por tipo Padrão + página pública</w:t>
             </w:r>
           </w:p>
         </w:tc>
@@ -5290,7 +5343,7 @@
               <w:rPr>
                 <w:sz w:val="19"/>
               </w:rPr>
-              <w:t>~12</w:t>
+              <w:t xml:space="preserve">~12</w:t>
             </w:r>
           </w:p>
         </w:tc>
@@ -5315,7 +5368,7 @@
               <w:rPr>
                 <w:sz w:val="19"/>
               </w:rPr>
-              <w:t>4</w:t>
+              <w:t xml:space="preserve">4</w:t>
             </w:r>
           </w:p>
         </w:tc>
@@ -5338,7 +5391,7 @@
               <w:rPr>
                 <w:sz w:val="19"/>
               </w:rPr>
-              <w:t>Colaboradores</w:t>
+              <w:t xml:space="preserve">Colaboradores</w:t>
             </w:r>
           </w:p>
         </w:tc>
@@ -5361,7 +5414,7 @@
               <w:rPr>
                 <w:sz w:val="19"/>
               </w:rPr>
-              <w:t>Tabela + funções de acesso por seção + rota de regras dedicada + convite/ativação + UI (aba Compartilhar, abas condicionais, lista)</w:t>
+              <w:t xml:space="preserve">Tabela + funções de acesso por seção + rota de regras dedicada + convite/ativação + UI (aba Compartilhar, abas condicionais, lista)</w:t>
             </w:r>
           </w:p>
         </w:tc>
@@ -5384,7 +5437,7 @@
               <w:rPr>
                 <w:sz w:val="19"/>
               </w:rPr>
-              <w:t>~25</w:t>
+              <w:t xml:space="preserve">~25</w:t>
             </w:r>
           </w:p>
         </w:tc>
@@ -5395,7 +5448,7 @@
         <w:spacing w:before="40" w:after="80"/>
       </w:pPr>
       <w:r>
-        <w:t>As fases 1–3 são independentes entre si; a 4 depende apenas da 1. Total estimado: ~65 testes novos sobre os 127 atuais. Risco nº 1 (regressão do isolamento multi-tenant) mitigado por não alterar as validações de posse existentes e por casos novos obrigatórios na suíte de segurança: sem vínculo = 404 em todas as rotas de seção; pendente não acessa nada; colaborador sem flag = 403 na seção certa e nunca em Config/Banners; ex-colaborador = 404; lista não vaza campeonatos de terceiros.</w:t>
+        <w:t xml:space="preserve">As fases 1–3 são independentes entre si; a 4 depende apenas da 1. Total estimado: ~65 testes novos sobre os 127 atuais. Risco nº 1 (regressão do isolamento multi-tenant) mitigado por não alterar as validações de posse existentes e por casos novos obrigatórios na suíte de segurança: sem vínculo = 404 em todas as rotas de seção; pendente não acessa nada; colaborador sem flag = 403 na seção certa e nunca em Config/Banners; ex-colaborador = 404; lista não vaza campeonatos de terceiros.</w:t>
       </w:r>
     </w:p>
     <w:p>
@@ -5403,7 +5456,7 @@
         <w:pStyle w:val="Heading1"/>
       </w:pPr>
       <w:r>
-        <w:t>10. Questões em aberto</w:t>
+        <w:t xml:space="preserve">10. Questões em aberto</w:t>
       </w:r>
     </w:p>
     <w:tbl>
@@ -5444,7 +5497,7 @@
                 <w:color w:val="FFFFFF"/>
                 <w:sz w:val="19"/>
               </w:rPr>
-              <w:t>Questão</w:t>
+              <w:t xml:space="preserve">Questão</w:t>
             </w:r>
           </w:p>
         </w:tc>
@@ -5470,7 +5523,7 @@
                 <w:color w:val="FFFFFF"/>
                 <w:sz w:val="19"/>
               </w:rPr>
-              <w:t>Proposta inicial</w:t>
+              <w:t xml:space="preserve">Proposta inicial</w:t>
             </w:r>
           </w:p>
         </w:tc>
@@ -5496,7 +5549,7 @@
                 <w:b/>
                 <w:sz w:val="19"/>
               </w:rPr>
-              <w:t>Teto de jogadores na Pelada Épica (jogadores sem time fixo)</w:t>
+              <w:t xml:space="preserve">Teto de jogadores na Pelada Épica (jogadores sem time fixo)</w:t>
             </w:r>
           </w:p>
         </w:tc>
@@ -5519,7 +5572,7 @@
               <w:rPr>
                 <w:sz w:val="19"/>
               </w:rPr>
-              <w:t>Máx. por campeonato = jogadores/time × nº de divisões (2 divisões = 60). A confirmar.</w:t>
+              <w:t xml:space="preserve">Máx. por campeonato = jogadores/time × nº de divisões (2 divisões = 60). A confirmar.</w:t>
             </w:r>
           </w:p>
         </w:tc>
@@ -5545,7 +5598,7 @@
                 <w:b/>
                 <w:sz w:val="19"/>
               </w:rPr>
-              <w:t>Posição/rótulo do Banner Especial na página pública</w:t>
+              <w:t xml:space="preserve">Posição/rótulo do Banner Especial na página pública</w:t>
             </w:r>
           </w:p>
         </w:tc>
@@ -5568,7 +5621,7 @@
               <w:rPr>
                 <w:sz w:val="19"/>
               </w:rPr>
-              <w:t>No bloco "Apoio" existente, acima dos banners do campeonato. Alternativa: bloco próprio no topo.</w:t>
+              <w:t xml:space="preserve">No bloco "Apoio" existente, acima dos banners do campeonato. Alternativa: bloco próprio no topo.</w:t>
             </w:r>
           </w:p>
         </w:tc>
@@ -5594,7 +5647,7 @@
                 <w:b/>
                 <w:sz w:val="19"/>
               </w:rPr>
-              <w:t>E-mail de convite ao colaborador</w:t>
+              <w:t xml:space="preserve">E-mail de convite ao colaborador</w:t>
             </w:r>
           </w:p>
         </w:tc>
@@ -5617,7 +5670,7 @@
               <w:rPr>
                 <w:sz w:val="19"/>
               </w:rPr>
-              <w:t>Enviar sempre (ativo e pendente); o pendente recebe orientação de criar a conta com aquele e-mail.</w:t>
+              <w:t xml:space="preserve">Enviar sempre (ativo e pendente); o pendente recebe orientação de criar a conta com aquele e-mail.</w:t>
             </w:r>
           </w:p>
         </w:tc>
@@ -5643,8 +5696,7 @@
                 <w:b/>
                 <w:sz w:val="19"/>
               </w:rPr>
-              <w:lastRenderedPageBreak/>
-              <w:t>Números dos planos (3/10/30)</w:t>
+              <w:t xml:space="preserve">Números dos planos (3/10/30)</w:t>
             </w:r>
           </w:p>
         </w:tc>
@@ -5667,7 +5719,7 @@
               <w:rPr>
                 <w:sz w:val="19"/>
               </w:rPr>
-              <w:t>Conforme definido; ajustáveis por override sem mudar código.</w:t>
+              <w:t xml:space="preserve">Conforme definido; ajustáveis por override sem mudar código.</w:t>
             </w:r>
           </w:p>
         </w:tc>
@@ -5679,7 +5731,7 @@
         <w:pStyle w:val="Muted"/>
       </w:pPr>
       <w:r>
-        <w:t>— Fim do documento —</w:t>
+        <w:t xml:space="preserve">— Fim do documento —</w:t>
       </w:r>
     </w:p>
     <w:sectPr>

</xml_diff>